<commit_message>
Further updated documentation. W.I.P
</commit_message>
<xml_diff>
--- a/Documentation/Fejlesztői_Dokumentáció.docx
+++ b/Documentation/Fejlesztői_Dokumentáció.docx
@@ -1,6 +1,6 @@
 
 <file path=word/document.xml><?xml version="1.0" encoding="utf-8"?>
-<w:document xmlns:wpc="http://schemas.microsoft.com/office/word/2010/wordprocessingCanvas" xmlns:cx="http://schemas.microsoft.com/office/drawing/2014/chartex" xmlns:cx1="http://schemas.microsoft.com/office/drawing/2015/9/8/chartex" xmlns:cx2="http://schemas.microsoft.com/office/drawing/2015/10/21/chartex" xmlns:cx3="http://schemas.microsoft.com/office/drawing/2016/5/9/chartex" xmlns:cx4="http://schemas.microsoft.com/office/drawing/2016/5/10/chartex" xmlns:cx5="http://schemas.microsoft.com/office/drawing/2016/5/11/chartex" xmlns:cx6="http://schemas.microsoft.com/office/drawing/2016/5/12/chartex" xmlns:cx7="http://schemas.microsoft.com/office/drawing/2016/5/13/chartex" xmlns:cx8="http://schemas.microsoft.com/office/drawing/2016/5/14/chartex" xmlns:mc="http://schemas.openxmlformats.org/markup-compatibility/2006" xmlns:aink="http://schemas.microsoft.com/office/drawing/2016/ink" xmlns:am3d="http://schemas.microsoft.com/office/drawing/2017/model3d" xmlns:o="urn:schemas-microsoft-com:office:office" xmlns:r="http://schemas.openxmlformats.org/officeDocument/2006/relationships" xmlns:m="http://schemas.openxmlformats.org/officeDocument/2006/math" xmlns:v="urn:schemas-microsoft-com:vml" xmlns:wp14="http://schemas.microsoft.com/office/word/2010/wordprocessingDrawing" xmlns:wp="http://schemas.openxmlformats.org/drawingml/2006/wordprocessingDrawing" xmlns:w10="urn:schemas-microsoft-com:office:word" xmlns:w="http://schemas.openxmlformats.org/wordprocessingml/2006/main" xmlns:w14="http://schemas.microsoft.com/office/word/2010/wordml" xmlns:w15="http://schemas.microsoft.com/office/word/2012/wordml" xmlns:w16cid="http://schemas.microsoft.com/office/word/2016/wordml/cid" xmlns:w16se="http://schemas.microsoft.com/office/word/2015/wordml/symex" xmlns:wpg="http://schemas.microsoft.com/office/word/2010/wordprocessingGroup" xmlns:wpi="http://schemas.microsoft.com/office/word/2010/wordprocessingInk" xmlns:wne="http://schemas.microsoft.com/office/word/2006/wordml" xmlns:wps="http://schemas.microsoft.com/office/word/2010/wordprocessingShape" mc:Ignorable="w14 w15 w16se w16cid wp14">
+<w:document xmlns:wpc="http://schemas.microsoft.com/office/word/2010/wordprocessingCanvas" xmlns:cx="http://schemas.microsoft.com/office/drawing/2014/chartex" xmlns:cx1="http://schemas.microsoft.com/office/drawing/2015/9/8/chartex" xmlns:cx2="http://schemas.microsoft.com/office/drawing/2015/10/21/chartex" xmlns:cx3="http://schemas.microsoft.com/office/drawing/2016/5/9/chartex" xmlns:cx4="http://schemas.microsoft.com/office/drawing/2016/5/10/chartex" xmlns:cx5="http://schemas.microsoft.com/office/drawing/2016/5/11/chartex" xmlns:cx6="http://schemas.microsoft.com/office/drawing/2016/5/12/chartex" xmlns:cx7="http://schemas.microsoft.com/office/drawing/2016/5/13/chartex" xmlns:cx8="http://schemas.microsoft.com/office/drawing/2016/5/14/chartex" xmlns:mc="http://schemas.openxmlformats.org/markup-compatibility/2006" xmlns:aink="http://schemas.microsoft.com/office/drawing/2016/ink" xmlns:am3d="http://schemas.microsoft.com/office/drawing/2017/model3d" xmlns:o="urn:schemas-microsoft-com:office:office" xmlns:oel="http://schemas.microsoft.com/office/2019/extlst" xmlns:r="http://schemas.openxmlformats.org/officeDocument/2006/relationships" xmlns:m="http://schemas.openxmlformats.org/officeDocument/2006/math" xmlns:v="urn:schemas-microsoft-com:vml" xmlns:wp14="http://schemas.microsoft.com/office/word/2010/wordprocessingDrawing" xmlns:wp="http://schemas.openxmlformats.org/drawingml/2006/wordprocessingDrawing" xmlns:w10="urn:schemas-microsoft-com:office:word" xmlns:w="http://schemas.openxmlformats.org/wordprocessingml/2006/main" xmlns:w14="http://schemas.microsoft.com/office/word/2010/wordml" xmlns:w15="http://schemas.microsoft.com/office/word/2012/wordml" xmlns:w16cex="http://schemas.microsoft.com/office/word/2018/wordml/cex" xmlns:w16cid="http://schemas.microsoft.com/office/word/2016/wordml/cid" xmlns:w16="http://schemas.microsoft.com/office/word/2018/wordml" xmlns:w16du="http://schemas.microsoft.com/office/word/2023/wordml/word16du" xmlns:w16sdtdh="http://schemas.microsoft.com/office/word/2020/wordml/sdtdatahash" xmlns:w16sdtfl="http://schemas.microsoft.com/office/word/2024/wordml/sdtformatlock" xmlns:w16se="http://schemas.microsoft.com/office/word/2015/wordml/symex" xmlns:wpg="http://schemas.microsoft.com/office/word/2010/wordprocessingGroup" xmlns:wpi="http://schemas.microsoft.com/office/word/2010/wordprocessingInk" xmlns:wne="http://schemas.microsoft.com/office/word/2006/wordml" xmlns:wps="http://schemas.microsoft.com/office/word/2010/wordprocessingShape" mc:Ignorable="w14 w15 w16se w16cid w16 w16cex w16sdtdh w16sdtfl w16du wp14">
   <w:body>
     <w:p/>
     <w:p>
@@ -146,22 +146,67 @@
         <w:spacing w:line="240" w:lineRule="auto"/>
         <w:jc w:val="right"/>
         <w:rPr>
-          <w:sz w:val="56"/>
-          <w:szCs w:val="56"/>
-        </w:rPr>
-      </w:pPr>
-      <w:r>
-        <w:rPr>
           <w:sz w:val="36"/>
           <w:szCs w:val="36"/>
         </w:rPr>
+      </w:pPr>
+      <w:r>
+        <w:rPr>
+          <w:sz w:val="36"/>
+          <w:szCs w:val="36"/>
+        </w:rPr>
         <w:t>Witmann Bence Zsolt</w:t>
       </w:r>
-      <w:r>
-        <w:rPr>
-          <w:sz w:val="56"/>
-          <w:szCs w:val="56"/>
-        </w:rPr>
+    </w:p>
+    <w:p>
+      <w:pPr>
+        <w:spacing w:line="240" w:lineRule="auto"/>
+        <w:jc w:val="right"/>
+        <w:rPr>
+          <w:sz w:val="36"/>
+          <w:szCs w:val="36"/>
+        </w:rPr>
+      </w:pPr>
+    </w:p>
+    <w:p>
+      <w:pPr>
+        <w:spacing w:line="240" w:lineRule="auto"/>
+        <w:jc w:val="right"/>
+        <w:rPr>
+          <w:sz w:val="36"/>
+          <w:szCs w:val="36"/>
+        </w:rPr>
+      </w:pPr>
+    </w:p>
+    <w:p>
+      <w:pPr>
+        <w:spacing w:line="240" w:lineRule="auto"/>
+        <w:jc w:val="right"/>
+        <w:rPr>
+          <w:sz w:val="36"/>
+          <w:szCs w:val="36"/>
+        </w:rPr>
+      </w:pPr>
+    </w:p>
+    <w:p>
+      <w:pPr>
+        <w:spacing w:line="240" w:lineRule="auto"/>
+        <w:jc w:val="right"/>
+        <w:rPr>
+          <w:sz w:val="36"/>
+          <w:szCs w:val="36"/>
+        </w:rPr>
+      </w:pPr>
+    </w:p>
+    <w:p>
+      <w:pPr>
+        <w:spacing w:line="240" w:lineRule="auto"/>
+        <w:jc w:val="center"/>
+      </w:pPr>
+      <w:r>
+        <w:t>1</w:t>
+      </w:r>
+      <w:r>
         <w:br w:type="page"/>
       </w:r>
     </w:p>
@@ -195,189 +240,539 @@
         <w:ind w:left="1416" w:hanging="696"/>
       </w:pPr>
       <w:r>
-        <w:t xml:space="preserve">1. Fejlesztői környezet bemutatása .............................................................. </w:t>
+        <w:t>1. Fejlesztői környezet bemutatása ........................................................</w:t>
+      </w:r>
+      <w:r>
+        <w:t>...</w:t>
+      </w:r>
+      <w:r>
+        <w:t xml:space="preserve">...... </w:t>
+      </w:r>
+      <w:r>
+        <w:t>4</w:t>
+      </w:r>
+    </w:p>
+    <w:p>
+      <w:pPr>
+        <w:ind w:left="1416" w:hanging="696"/>
+      </w:pPr>
+      <w:r>
+        <w:t xml:space="preserve">1.1. Visual </w:t>
+      </w:r>
+      <w:proofErr w:type="spellStart"/>
+      <w:r>
+        <w:t>Studio</w:t>
+      </w:r>
+      <w:proofErr w:type="spellEnd"/>
+      <w:r>
+        <w:t xml:space="preserve"> 2022 ................................................................................</w:t>
+      </w:r>
+      <w:r>
+        <w:t xml:space="preserve">. </w:t>
+      </w:r>
+      <w:r>
+        <w:t>4</w:t>
+      </w:r>
+    </w:p>
+    <w:p>
+      <w:pPr>
+        <w:ind w:left="1416" w:hanging="696"/>
+      </w:pPr>
+      <w:r>
+        <w:t xml:space="preserve">1.2. Visual </w:t>
+      </w:r>
+      <w:proofErr w:type="spellStart"/>
+      <w:r>
+        <w:t>Studio</w:t>
+      </w:r>
+      <w:proofErr w:type="spellEnd"/>
+      <w:r>
+        <w:t xml:space="preserve"> </w:t>
+      </w:r>
+      <w:proofErr w:type="spellStart"/>
+      <w:r>
+        <w:t>Code</w:t>
+      </w:r>
+      <w:proofErr w:type="spellEnd"/>
+      <w:r>
+        <w:t xml:space="preserve"> ................................................................................</w:t>
+      </w:r>
+      <w:r>
+        <w:t>.</w:t>
+      </w:r>
+      <w:r>
+        <w:t xml:space="preserve"> </w:t>
+      </w:r>
+      <w:r>
+        <w:t>4</w:t>
+      </w:r>
+    </w:p>
+    <w:p>
+      <w:pPr>
+        <w:ind w:left="1416" w:hanging="696"/>
+      </w:pPr>
+      <w:r>
+        <w:t xml:space="preserve">1.3. </w:t>
+      </w:r>
+      <w:proofErr w:type="spellStart"/>
+      <w:proofErr w:type="gramStart"/>
+      <w:r>
+        <w:t>MySQL</w:t>
+      </w:r>
+      <w:proofErr w:type="spellEnd"/>
+      <w:r>
+        <w:t xml:space="preserve">  …</w:t>
+      </w:r>
+      <w:proofErr w:type="gramEnd"/>
+      <w:r>
+        <w:t>……………........................................................</w:t>
+      </w:r>
+      <w:r>
+        <w:t>....</w:t>
+      </w:r>
+      <w:r>
+        <w:t xml:space="preserve">..................... </w:t>
+      </w:r>
+      <w:r>
+        <w:t>4</w:t>
+      </w:r>
+    </w:p>
+    <w:p>
+      <w:pPr>
+        <w:ind w:left="1416" w:hanging="696"/>
+      </w:pPr>
+      <w:r>
+        <w:t>1.</w:t>
+      </w:r>
+      <w:r>
+        <w:t>4</w:t>
+      </w:r>
+      <w:r>
+        <w:t xml:space="preserve">. </w:t>
+      </w:r>
+      <w:proofErr w:type="spellStart"/>
+      <w:r>
+        <w:t>phpMyAdmin</w:t>
+      </w:r>
+      <w:proofErr w:type="spellEnd"/>
+      <w:r>
+        <w:t xml:space="preserve"> ………….....................................................................</w:t>
+      </w:r>
+      <w:r>
+        <w:t>..</w:t>
+      </w:r>
+      <w:r>
+        <w:t xml:space="preserve">....... </w:t>
+      </w:r>
+      <w:r>
+        <w:t>5</w:t>
+      </w:r>
+    </w:p>
+    <w:p>
+      <w:pPr>
+        <w:ind w:left="1416" w:hanging="696"/>
+      </w:pPr>
+      <w:r>
+        <w:t>1</w:t>
+      </w:r>
+      <w:r>
+        <w:t>.</w:t>
+      </w:r>
+      <w:r>
+        <w:t>5</w:t>
+      </w:r>
+      <w:r>
+        <w:t xml:space="preserve">. </w:t>
+      </w:r>
+      <w:proofErr w:type="spellStart"/>
+      <w:r>
+        <w:t>Trello</w:t>
+      </w:r>
+      <w:proofErr w:type="spellEnd"/>
+      <w:r>
+        <w:t xml:space="preserve"> .....</w:t>
+      </w:r>
+      <w:r>
+        <w:t>.....</w:t>
+      </w:r>
+      <w:r>
+        <w:t>...................................................................................</w:t>
+      </w:r>
+      <w:r>
+        <w:t>.</w:t>
+      </w:r>
+      <w:r>
+        <w:t xml:space="preserve">........ </w:t>
+      </w:r>
+      <w:r>
+        <w:t>5</w:t>
+      </w:r>
+    </w:p>
+    <w:p>
+      <w:pPr>
+        <w:ind w:left="1416" w:hanging="696"/>
+      </w:pPr>
+      <w:r>
+        <w:t>1</w:t>
+      </w:r>
+      <w:r>
+        <w:t>.</w:t>
+      </w:r>
+      <w:r>
+        <w:t>6</w:t>
+      </w:r>
+      <w:r>
+        <w:t xml:space="preserve">. </w:t>
+      </w:r>
+      <w:proofErr w:type="spellStart"/>
+      <w:r>
+        <w:t>Github</w:t>
+      </w:r>
+      <w:proofErr w:type="spellEnd"/>
+      <w:r>
+        <w:t xml:space="preserve"> ..........................................................................................</w:t>
+      </w:r>
+      <w:r>
+        <w:t>.</w:t>
+      </w:r>
+      <w:r>
+        <w:t xml:space="preserve">......... </w:t>
+      </w:r>
+      <w:r>
+        <w:t>6</w:t>
+      </w:r>
+    </w:p>
+    <w:p>
+      <w:r>
+        <w:tab/>
+      </w:r>
+      <w:r>
+        <w:t>1</w:t>
+      </w:r>
+      <w:r>
+        <w:t>.</w:t>
+      </w:r>
+      <w:r>
+        <w:t>7</w:t>
+      </w:r>
+      <w:r>
+        <w:t>. React.js ........................................................................................</w:t>
+      </w:r>
+      <w:r>
+        <w:t>.</w:t>
+      </w:r>
+      <w:r>
+        <w:t xml:space="preserve">......... </w:t>
+      </w:r>
+      <w:r>
+        <w:t>6</w:t>
+      </w:r>
+    </w:p>
+    <w:p>
+      <w:r>
+        <w:tab/>
+      </w:r>
+      <w:r>
+        <w:t>1</w:t>
+      </w:r>
+      <w:r>
+        <w:t>.</w:t>
+      </w:r>
+      <w:r>
+        <w:t>8</w:t>
+      </w:r>
+      <w:r>
+        <w:t>. ASP.NET Web API ..........................................................................</w:t>
+      </w:r>
+      <w:r>
+        <w:t>...</w:t>
+      </w:r>
+      <w:r>
+        <w:t xml:space="preserve">....... </w:t>
+      </w:r>
+      <w:r>
+        <w:t>7</w:t>
+      </w:r>
+    </w:p>
+    <w:p>
+      <w:pPr>
+        <w:ind w:firstLine="708"/>
+      </w:pPr>
+      <w:r>
+        <w:t>1.</w:t>
+      </w:r>
+      <w:r>
+        <w:t>9</w:t>
+      </w:r>
+      <w:r>
+        <w:t xml:space="preserve">. </w:t>
+      </w:r>
+      <w:r>
+        <w:t>HTML</w:t>
+      </w:r>
+      <w:r>
+        <w:t xml:space="preserve"> ................................................................</w:t>
+      </w:r>
+      <w:r>
+        <w:t>..................</w:t>
+      </w:r>
+      <w:r>
+        <w:t>......</w:t>
+      </w:r>
+      <w:r>
+        <w:t>..</w:t>
+      </w:r>
+      <w:r>
+        <w:t>........... 7</w:t>
+      </w:r>
+    </w:p>
+    <w:p>
+      <w:pPr>
+        <w:ind w:firstLine="708"/>
+      </w:pPr>
+      <w:r>
+        <w:t>1.</w:t>
+      </w:r>
+      <w:r>
+        <w:t>10</w:t>
+      </w:r>
+      <w:r>
+        <w:t xml:space="preserve">. </w:t>
+      </w:r>
+      <w:r>
+        <w:t>CSS</w:t>
+      </w:r>
+      <w:r>
+        <w:t xml:space="preserve"> .................................................................................................... </w:t>
+      </w:r>
+      <w:r>
+        <w:t>8</w:t>
+      </w:r>
+    </w:p>
+    <w:p>
+      <w:pPr>
+        <w:ind w:firstLine="708"/>
+      </w:pPr>
+      <w:r>
+        <w:t>1.1</w:t>
+      </w:r>
+      <w:r>
+        <w:t>1</w:t>
+      </w:r>
+      <w:r>
+        <w:t xml:space="preserve">. </w:t>
+      </w:r>
+      <w:proofErr w:type="spellStart"/>
+      <w:r>
+        <w:t>Javascript</w:t>
+      </w:r>
+      <w:proofErr w:type="spellEnd"/>
+      <w:r>
+        <w:t xml:space="preserve"> ............................................................................................ 8</w:t>
+      </w:r>
+    </w:p>
+    <w:p>
+      <w:pPr>
+        <w:ind w:firstLine="708"/>
+      </w:pPr>
+      <w:r>
+        <w:t>1.1</w:t>
+      </w:r>
+      <w:r>
+        <w:t xml:space="preserve">2. </w:t>
+      </w:r>
+      <w:proofErr w:type="spellStart"/>
+      <w:r>
+        <w:t>Bootstrap</w:t>
+      </w:r>
+      <w:proofErr w:type="spellEnd"/>
+      <w:r>
+        <w:t xml:space="preserve"> ............................................................................................ 8</w:t>
+      </w:r>
+    </w:p>
+    <w:p>
+      <w:pPr>
+        <w:ind w:firstLine="708"/>
+      </w:pPr>
+      <w:r>
+        <w:t>1.1</w:t>
       </w:r>
       <w:r>
         <w:t>3</w:t>
       </w:r>
-    </w:p>
-    <w:p>
-      <w:pPr>
-        <w:ind w:left="1416" w:hanging="696"/>
-      </w:pPr>
-      <w:r>
-        <w:t xml:space="preserve">1.1. Visual </w:t>
-      </w:r>
-      <w:proofErr w:type="spellStart"/>
-      <w:r>
-        <w:t>Studio</w:t>
-      </w:r>
-      <w:proofErr w:type="spellEnd"/>
-      <w:r>
-        <w:t xml:space="preserve"> 2022 ................................................................................</w:t>
-      </w:r>
-      <w:r>
-        <w:t>. 3</w:t>
-      </w:r>
-    </w:p>
-    <w:p>
-      <w:pPr>
-        <w:ind w:left="1416" w:hanging="696"/>
-      </w:pPr>
-      <w:r>
-        <w:t xml:space="preserve">1.2. Visual </w:t>
-      </w:r>
-      <w:proofErr w:type="spellStart"/>
-      <w:r>
-        <w:t>Studio</w:t>
-      </w:r>
-      <w:proofErr w:type="spellEnd"/>
-      <w:r>
-        <w:t xml:space="preserve"> </w:t>
-      </w:r>
-      <w:proofErr w:type="spellStart"/>
-      <w:r>
-        <w:t>Code</w:t>
-      </w:r>
-      <w:proofErr w:type="spellEnd"/>
-      <w:r>
-        <w:t xml:space="preserve"> ................................................................................</w:t>
-      </w:r>
-      <w:r>
-        <w:t>.</w:t>
-      </w:r>
-      <w:r>
-        <w:t xml:space="preserve"> </w:t>
-      </w:r>
+      <w:r>
+        <w:t xml:space="preserve">. </w:t>
+      </w:r>
+      <w:r>
+        <w:t>C#</w:t>
+      </w:r>
+      <w:r>
+        <w:t xml:space="preserve"> .......................................................</w:t>
+      </w:r>
+      <w:r>
+        <w:t>...........</w:t>
+      </w:r>
+      <w:r>
+        <w:t>..................................... 8</w:t>
+      </w:r>
+    </w:p>
+    <w:p>
+      <w:pPr>
+        <w:ind w:firstLine="708"/>
+      </w:pPr>
+    </w:p>
+    <w:p/>
+    <w:p/>
+    <w:p/>
+    <w:p/>
+    <w:p/>
+    <w:p/>
+    <w:p/>
+    <w:p/>
+    <w:p/>
+    <w:p>
+      <w:pPr>
+        <w:jc w:val="center"/>
+      </w:pPr>
+      <w:r>
+        <w:t>2</w:t>
+      </w:r>
+      <w:r>
+        <w:br w:type="page"/>
+      </w:r>
+    </w:p>
+    <w:p>
+      <w:pPr>
+        <w:jc w:val="center"/>
+        <w:rPr>
+          <w:b/>
+          <w:bCs/>
+          <w:sz w:val="52"/>
+          <w:szCs w:val="52"/>
+        </w:rPr>
+      </w:pPr>
+      <w:r>
+        <w:rPr>
+          <w:b/>
+          <w:bCs/>
+          <w:sz w:val="52"/>
+          <w:szCs w:val="52"/>
+        </w:rPr>
+        <w:lastRenderedPageBreak/>
+        <w:t>Bevezetés</w:t>
+      </w:r>
+    </w:p>
+    <w:p>
+      <w:pPr>
+        <w:jc w:val="center"/>
+        <w:rPr>
+          <w:b/>
+          <w:bCs/>
+          <w:sz w:val="52"/>
+          <w:szCs w:val="52"/>
+        </w:rPr>
+      </w:pPr>
+    </w:p>
+    <w:p>
+      <w:r>
+        <w:rPr>
+          <w:sz w:val="28"/>
+          <w:szCs w:val="28"/>
+        </w:rPr>
+        <w:t>Mai napjainkban eszméletlen sebességgel fejlődik a világ, így egyre nehezebb kitanulni egyes szakmákat és készségeket, mely</w:t>
+      </w:r>
+      <w:r>
+        <w:rPr>
+          <w:sz w:val="28"/>
+          <w:szCs w:val="28"/>
+        </w:rPr>
+        <w:t>ek</w:t>
+      </w:r>
+      <w:r>
+        <w:rPr>
+          <w:sz w:val="28"/>
+          <w:szCs w:val="28"/>
+        </w:rPr>
+        <w:t xml:space="preserve"> a mindennapi életünk szerves részét képezhetik. Legyen az főzés, autószerelés, egy idegen nyelv elsajátítása, vagy bármi egyéb. Erre a problémára igyekszünk megoldást kínálni a projektünk segítségével, a </w:t>
+      </w:r>
+      <w:r>
+        <w:rPr>
+          <w:b/>
+          <w:bCs/>
+          <w:sz w:val="28"/>
+          <w:szCs w:val="28"/>
+        </w:rPr>
+        <w:t>Time Bank</w:t>
+      </w:r>
+      <w:r>
+        <w:rPr>
+          <w:sz w:val="28"/>
+          <w:szCs w:val="28"/>
+        </w:rPr>
+        <w:t xml:space="preserve">kal! Felhasználóink segítséget nyújthatnak azon tevékenységekkel, melyben készségeik engedik. Ezzel az oldalon egy valutára tehetnek szert, mellyel ő maguk </w:t>
+      </w:r>
+      <w:r>
+        <w:rPr>
+          <w:sz w:val="28"/>
+          <w:szCs w:val="28"/>
+        </w:rPr>
+        <w:t>is</w:t>
+      </w:r>
+      <w:r>
+        <w:rPr>
+          <w:sz w:val="28"/>
+          <w:szCs w:val="28"/>
+        </w:rPr>
+        <w:t xml:space="preserve"> segítséget kérhetnek</w:t>
+      </w:r>
+      <w:r>
+        <w:rPr>
+          <w:sz w:val="28"/>
+          <w:szCs w:val="28"/>
+        </w:rPr>
+        <w:t>, ezzel közreműködve az ökoszisztémánkhoz.</w:t>
+      </w:r>
+    </w:p>
+    <w:p/>
+    <w:p/>
+    <w:p/>
+    <w:p/>
+    <w:p/>
+    <w:p/>
+    <w:p/>
+    <w:p/>
+    <w:p/>
+    <w:p/>
+    <w:p/>
+    <w:p/>
+    <w:p/>
+    <w:p/>
+    <w:p/>
+    <w:p/>
+    <w:p>
+      <w:pPr>
+        <w:jc w:val="center"/>
+        <w:rPr>
+          <w:b/>
+          <w:bCs/>
+          <w:sz w:val="52"/>
+          <w:szCs w:val="52"/>
+        </w:rPr>
+      </w:pPr>
       <w:r>
         <w:t>3</w:t>
       </w:r>
-    </w:p>
-    <w:p>
-      <w:pPr>
-        <w:ind w:left="1416" w:hanging="696"/>
-      </w:pPr>
-      <w:r>
-        <w:t xml:space="preserve">1.3. </w:t>
-      </w:r>
-      <w:proofErr w:type="spellStart"/>
-      <w:r>
-        <w:t>MySQL</w:t>
-      </w:r>
-      <w:proofErr w:type="spellEnd"/>
-      <w:r>
-        <w:t xml:space="preserve">  ………………............................................................................. </w:t>
-      </w:r>
-      <w:r>
-        <w:t>3</w:t>
-      </w:r>
-    </w:p>
-    <w:p>
-      <w:pPr>
-        <w:ind w:left="1416" w:hanging="696"/>
-      </w:pPr>
-      <w:r>
-        <w:t xml:space="preserve">1.3. </w:t>
-      </w:r>
-      <w:proofErr w:type="spellStart"/>
-      <w:r>
-        <w:t>phpMyAdmin</w:t>
-      </w:r>
-      <w:proofErr w:type="spellEnd"/>
-      <w:r>
-        <w:t xml:space="preserve"> …………............................................................................ 4</w:t>
-      </w:r>
-    </w:p>
-    <w:p>
-      <w:pPr>
-        <w:ind w:left="1416" w:hanging="696"/>
-      </w:pPr>
-      <w:r>
-        <w:t>2</w:t>
-      </w:r>
-      <w:r>
-        <w:t xml:space="preserve">. Használt technológiák .............................................................................. </w:t>
-      </w:r>
-      <w:r>
-        <w:t>4</w:t>
-      </w:r>
-    </w:p>
-    <w:p>
-      <w:pPr>
-        <w:ind w:left="1416" w:hanging="696"/>
-      </w:pPr>
-      <w:r>
-        <w:t>2</w:t>
-      </w:r>
-      <w:r>
-        <w:t xml:space="preserve">.1. </w:t>
-      </w:r>
-      <w:proofErr w:type="spellStart"/>
-      <w:r>
-        <w:t>Trello</w:t>
-      </w:r>
-      <w:proofErr w:type="spellEnd"/>
-      <w:r>
-        <w:t xml:space="preserve"> .....</w:t>
-      </w:r>
-      <w:r>
-        <w:t>.....</w:t>
-      </w:r>
-      <w:r>
-        <w:t xml:space="preserve">........................................................................................... </w:t>
-      </w:r>
-      <w:r>
-        <w:t>4</w:t>
-      </w:r>
-    </w:p>
-    <w:p>
-      <w:pPr>
-        <w:ind w:left="1416" w:hanging="696"/>
-      </w:pPr>
-      <w:r>
-        <w:t>2</w:t>
-      </w:r>
-      <w:r>
-        <w:t>.</w:t>
-      </w:r>
-      <w:r>
-        <w:t>2</w:t>
-      </w:r>
-      <w:r>
-        <w:t xml:space="preserve">. </w:t>
-      </w:r>
-      <w:proofErr w:type="spellStart"/>
-      <w:r>
-        <w:t>Github</w:t>
-      </w:r>
-      <w:proofErr w:type="spellEnd"/>
-      <w:r>
-        <w:t xml:space="preserve"> ................................................................................................... </w:t>
-      </w:r>
-      <w:r>
-        <w:t>5</w:t>
-      </w:r>
-    </w:p>
-    <w:p>
-      <w:r>
-        <w:tab/>
-        <w:t>2.3. React.js ................................................................................................. 5</w:t>
-      </w:r>
-    </w:p>
-    <w:p>
-      <w:r>
-        <w:tab/>
-        <w:t xml:space="preserve">2.4. ASP.NET Web API ................................................................................. </w:t>
-      </w:r>
-      <w:r>
-        <w:t>6</w:t>
-      </w:r>
-      <w:bookmarkStart w:id="0" w:name="_GoBack"/>
-      <w:bookmarkEnd w:id="0"/>
-      <w:r>
+      <w:r>
+        <w:rPr>
+          <w:b/>
+          <w:bCs/>
+          <w:sz w:val="52"/>
+          <w:szCs w:val="52"/>
+        </w:rPr>
         <w:br w:type="page"/>
       </w:r>
     </w:p>
+    <w:p/>
     <w:p>
       <w:pPr>
         <w:pStyle w:val="Listaszerbekezds"/>
@@ -399,7 +794,6 @@
           <w:sz w:val="44"/>
           <w:szCs w:val="44"/>
         </w:rPr>
-        <w:lastRenderedPageBreak/>
         <w:t>Fejlesztői környezet bemutatása</w:t>
       </w:r>
     </w:p>
@@ -651,6 +1045,7 @@
         <w:t xml:space="preserve"> </w:t>
       </w:r>
       <w:proofErr w:type="spellStart"/>
+      <w:proofErr w:type="gramStart"/>
       <w:r>
         <w:rPr>
           <w:rStyle w:val="Kiemels2"/>
@@ -666,7 +1061,15 @@
           <w:sz w:val="28"/>
           <w:szCs w:val="28"/>
         </w:rPr>
-        <w:t xml:space="preserve">  egy könnyű, gyors és ingyenes </w:t>
+        <w:t xml:space="preserve">  egy</w:t>
+      </w:r>
+      <w:proofErr w:type="gramEnd"/>
+      <w:r>
+        <w:rPr>
+          <w:sz w:val="28"/>
+          <w:szCs w:val="28"/>
+        </w:rPr>
+        <w:t xml:space="preserve"> könnyű, gyors és ingyenes </w:t>
       </w:r>
       <w:r>
         <w:rPr>
@@ -749,11 +1152,6 @@
         </w:rPr>
         <w:t>, amit bővítményekkel és kiegészítő funkciókkal lehet testre szabni, hogy teljes mértékben megfeleljen a fejlesztői igényeknek.</w:t>
       </w:r>
-    </w:p>
-    <w:p>
-      <w:pPr>
-        <w:ind w:left="720"/>
-      </w:pPr>
     </w:p>
     <w:p>
       <w:pPr>
@@ -936,6 +1334,18 @@
         <w:t xml:space="preserve"> rugalmas és képes hatékonyan kezelni különféle méretű adatbázisokat,</w:t>
       </w:r>
     </w:p>
+    <w:p>
+      <w:pPr>
+        <w:jc w:val="center"/>
+        <w:rPr>
+          <w:sz w:val="16"/>
+          <w:szCs w:val="16"/>
+        </w:rPr>
+      </w:pPr>
+      <w:r>
+        <w:t>4</w:t>
+      </w:r>
+    </w:p>
     <w:p/>
     <w:p/>
     <w:p>
@@ -952,7 +1362,6 @@
           <w:sz w:val="36"/>
           <w:szCs w:val="36"/>
         </w:rPr>
-        <w:lastRenderedPageBreak/>
         <w:t>1.4</w:t>
       </w:r>
       <w:r>
@@ -1082,33 +1491,6 @@
     <w:p/>
     <w:p>
       <w:pPr>
-        <w:jc w:val="center"/>
-        <w:rPr>
-          <w:b/>
-          <w:sz w:val="40"/>
-          <w:szCs w:val="40"/>
-        </w:rPr>
-      </w:pPr>
-      <w:r>
-        <w:rPr>
-          <w:b/>
-          <w:sz w:val="40"/>
-          <w:szCs w:val="40"/>
-        </w:rPr>
-        <w:t>2</w:t>
-      </w:r>
-      <w:r>
-        <w:rPr>
-          <w:b/>
-          <w:sz w:val="40"/>
-          <w:szCs w:val="40"/>
-        </w:rPr>
-        <w:t>. Használt technológiák</w:t>
-      </w:r>
-    </w:p>
-    <w:p/>
-    <w:p>
-      <w:pPr>
         <w:rPr>
           <w:b/>
           <w:bCs/>
@@ -1123,7 +1505,25 @@
           <w:sz w:val="36"/>
           <w:szCs w:val="36"/>
         </w:rPr>
-        <w:t>2.1</w:t>
+        <w:t>1</w:t>
+      </w:r>
+      <w:r>
+        <w:rPr>
+          <w:b/>
+          <w:bCs/>
+          <w:sz w:val="36"/>
+          <w:szCs w:val="36"/>
+        </w:rPr>
+        <w:t>.</w:t>
+      </w:r>
+      <w:r>
+        <w:rPr>
+          <w:b/>
+          <w:bCs/>
+          <w:sz w:val="36"/>
+          <w:szCs w:val="36"/>
+        </w:rPr>
+        <w:t>5</w:t>
       </w:r>
       <w:r>
         <w:rPr>
@@ -1269,7 +1669,7 @@
                     <pic:cNvPicPr/>
                   </pic:nvPicPr>
                   <pic:blipFill>
-                    <a:blip r:embed="rId6"/>
+                    <a:blip r:embed="rId8"/>
                     <a:stretch>
                       <a:fillRect/>
                     </a:stretch>
@@ -1292,19 +1692,74 @@
     </w:p>
     <w:p>
       <w:pPr>
-        <w:rPr>
-          <w:sz w:val="28"/>
-          <w:szCs w:val="28"/>
-        </w:rPr>
-      </w:pPr>
-    </w:p>
-    <w:p>
-      <w:pPr>
-        <w:rPr>
-          <w:sz w:val="28"/>
-          <w:szCs w:val="28"/>
-        </w:rPr>
-      </w:pPr>
+        <w:jc w:val="center"/>
+      </w:pPr>
+      <w:r>
+        <w:t>5</w:t>
+      </w:r>
+    </w:p>
+    <w:p>
+      <w:pPr>
+        <w:jc w:val="center"/>
+        <w:rPr>
+          <w:sz w:val="28"/>
+          <w:szCs w:val="28"/>
+        </w:rPr>
+      </w:pPr>
+      <w:r>
+        <w:rPr>
+          <w:noProof/>
+        </w:rPr>
+        <w:lastRenderedPageBreak/>
+        <w:drawing>
+          <wp:inline distT="0" distB="0" distL="0" distR="0" wp14:anchorId="585D0569" wp14:editId="6ECD6FC0">
+            <wp:extent cx="2524125" cy="1402292"/>
+            <wp:effectExtent l="0" t="0" r="0" b="7620"/>
+            <wp:docPr id="1118335416" name="Kép 2" descr="GitHub Logo Download - SVG - All Vector Logo"/>
+            <wp:cNvGraphicFramePr>
+              <a:graphicFrameLocks xmlns:a="http://schemas.openxmlformats.org/drawingml/2006/main" noChangeAspect="1"/>
+            </wp:cNvGraphicFramePr>
+            <a:graphic xmlns:a="http://schemas.openxmlformats.org/drawingml/2006/main">
+              <a:graphicData uri="http://schemas.openxmlformats.org/drawingml/2006/picture">
+                <pic:pic xmlns:pic="http://schemas.openxmlformats.org/drawingml/2006/picture">
+                  <pic:nvPicPr>
+                    <pic:cNvPr id="0" name="Picture 3" descr="GitHub Logo Download - SVG - All Vector Logo"/>
+                    <pic:cNvPicPr>
+                      <a:picLocks noChangeAspect="1" noChangeArrowheads="1"/>
+                    </pic:cNvPicPr>
+                  </pic:nvPicPr>
+                  <pic:blipFill>
+                    <a:blip r:embed="rId9" cstate="print">
+                      <a:extLst>
+                        <a:ext uri="{28A0092B-C50C-407E-A947-70E740481C1C}">
+                          <a14:useLocalDpi xmlns:a14="http://schemas.microsoft.com/office/drawing/2010/main" val="0"/>
+                        </a:ext>
+                      </a:extLst>
+                    </a:blip>
+                    <a:srcRect/>
+                    <a:stretch>
+                      <a:fillRect/>
+                    </a:stretch>
+                  </pic:blipFill>
+                  <pic:spPr bwMode="auto">
+                    <a:xfrm>
+                      <a:off x="0" y="0"/>
+                      <a:ext cx="2532631" cy="1407018"/>
+                    </a:xfrm>
+                    <a:prstGeom prst="rect">
+                      <a:avLst/>
+                    </a:prstGeom>
+                    <a:noFill/>
+                    <a:ln>
+                      <a:noFill/>
+                    </a:ln>
+                  </pic:spPr>
+                </pic:pic>
+              </a:graphicData>
+            </a:graphic>
+          </wp:inline>
+        </w:drawing>
+      </w:r>
     </w:p>
     <w:p>
       <w:pPr>
@@ -1320,270 +1775,373 @@
           <w:sz w:val="36"/>
           <w:szCs w:val="36"/>
         </w:rPr>
-        <w:t xml:space="preserve">2.2 </w:t>
-      </w:r>
-      <w:proofErr w:type="spellStart"/>
+        <w:t>1</w:t>
+      </w:r>
       <w:r>
         <w:rPr>
           <w:b/>
           <w:sz w:val="36"/>
           <w:szCs w:val="36"/>
         </w:rPr>
-        <w:t>Github</w:t>
-      </w:r>
-      <w:proofErr w:type="spellEnd"/>
-    </w:p>
-    <w:p>
-      <w:pPr>
-        <w:rPr>
-          <w:sz w:val="28"/>
-          <w:szCs w:val="28"/>
-          <w:lang w:eastAsia="hu-HU"/>
-        </w:rPr>
-      </w:pPr>
-      <w:r>
-        <w:rPr>
-          <w:sz w:val="28"/>
-          <w:szCs w:val="28"/>
-          <w:lang w:eastAsia="hu-HU"/>
-        </w:rPr>
-        <w:t xml:space="preserve">A GitHub egy online platform, amely lehetővé teszi a programozók és fejlesztők számára, hogy kódot tároljanak, megosszák és együtt dolgozzanak. A GitHub alapja a </w:t>
-      </w:r>
-      <w:proofErr w:type="spellStart"/>
-      <w:r>
-        <w:rPr>
-          <w:sz w:val="28"/>
-          <w:szCs w:val="28"/>
-          <w:lang w:eastAsia="hu-HU"/>
-        </w:rPr>
-        <w:t>Git</w:t>
-      </w:r>
-      <w:proofErr w:type="spellEnd"/>
-      <w:r>
-        <w:rPr>
-          <w:sz w:val="28"/>
-          <w:szCs w:val="28"/>
-          <w:lang w:eastAsia="hu-HU"/>
-        </w:rPr>
-        <w:t xml:space="preserve"> verziókezelő rendszer, amely segít a kód módosításainak nyomon követésében. Lehetővé teszi a csapatok számára, hogy könnyen dolgozzanak együtt, bárhol is legyenek, és megoldja a kódban történt változtatások összevonását, valamint a hibák kezelését.</w:t>
-      </w:r>
-    </w:p>
-    <w:p>
-      <w:pPr>
-        <w:rPr>
-          <w:sz w:val="28"/>
-          <w:szCs w:val="28"/>
-          <w:lang w:eastAsia="hu-HU"/>
-        </w:rPr>
-      </w:pPr>
-      <w:r>
-        <w:rPr>
-          <w:sz w:val="28"/>
-          <w:szCs w:val="28"/>
-          <w:lang w:eastAsia="hu-HU"/>
-        </w:rPr>
-        <w:t>A GitHub-</w:t>
-      </w:r>
-      <w:proofErr w:type="spellStart"/>
-      <w:r>
-        <w:rPr>
-          <w:sz w:val="28"/>
-          <w:szCs w:val="28"/>
-          <w:lang w:eastAsia="hu-HU"/>
-        </w:rPr>
-        <w:t>on</w:t>
-      </w:r>
-      <w:proofErr w:type="spellEnd"/>
-      <w:r>
-        <w:rPr>
-          <w:sz w:val="28"/>
-          <w:szCs w:val="28"/>
-          <w:lang w:eastAsia="hu-HU"/>
-        </w:rPr>
-        <w:t xml:space="preserve"> található kódokat "tárházaknak" (</w:t>
-      </w:r>
-      <w:proofErr w:type="spellStart"/>
-      <w:r>
-        <w:rPr>
-          <w:sz w:val="28"/>
-          <w:szCs w:val="28"/>
-          <w:lang w:eastAsia="hu-HU"/>
-        </w:rPr>
-        <w:t>repository</w:t>
-      </w:r>
-      <w:proofErr w:type="spellEnd"/>
-      <w:r>
-        <w:rPr>
-          <w:sz w:val="28"/>
-          <w:szCs w:val="28"/>
-          <w:lang w:eastAsia="hu-HU"/>
-        </w:rPr>
-        <w:t>) hívják, ahol a fejlesztők feltölthetik, módosíthatják és megoszthatják a projektjeiket. A felhasználók különböző jogosultságokkal rendelkezhetnek egy projektben: lehetnek adminisztrátorok, akik teljes hozzáférést kapnak, vagy egyszerű hozzájárulók, akik javaslatokat tehetnek a kód módosítására. A kód frissítéseit és változtatásait "</w:t>
-      </w:r>
-      <w:proofErr w:type="spellStart"/>
-      <w:r>
-        <w:rPr>
-          <w:sz w:val="28"/>
-          <w:szCs w:val="28"/>
-          <w:lang w:eastAsia="hu-HU"/>
-        </w:rPr>
-        <w:t>commiteknek</w:t>
-      </w:r>
-      <w:proofErr w:type="spellEnd"/>
-      <w:r>
-        <w:rPr>
-          <w:sz w:val="28"/>
-          <w:szCs w:val="28"/>
-          <w:lang w:eastAsia="hu-HU"/>
-        </w:rPr>
-        <w:t xml:space="preserve">" nevezik, és minden </w:t>
-      </w:r>
-      <w:proofErr w:type="spellStart"/>
-      <w:r>
-        <w:rPr>
-          <w:sz w:val="28"/>
-          <w:szCs w:val="28"/>
-          <w:lang w:eastAsia="hu-HU"/>
-        </w:rPr>
-        <w:t>commit</w:t>
-      </w:r>
-      <w:proofErr w:type="spellEnd"/>
-      <w:r>
-        <w:rPr>
-          <w:sz w:val="28"/>
-          <w:szCs w:val="28"/>
-          <w:lang w:eastAsia="hu-HU"/>
-        </w:rPr>
-        <w:t>-hoz megjegyzés is tartozik, hogy könnyen követhetők legyenek a módosítások.</w:t>
-      </w:r>
-    </w:p>
-    <w:p>
-      <w:pPr>
-        <w:rPr>
-          <w:lang w:eastAsia="hu-HU"/>
-        </w:rPr>
-      </w:pPr>
-      <w:r>
-        <w:rPr>
-          <w:sz w:val="28"/>
-          <w:szCs w:val="28"/>
-          <w:lang w:eastAsia="hu-HU"/>
-        </w:rPr>
-        <w:t>A GitHub lehetővé teszi a "</w:t>
-      </w:r>
-      <w:proofErr w:type="spellStart"/>
-      <w:r>
-        <w:rPr>
-          <w:sz w:val="28"/>
-          <w:szCs w:val="28"/>
-          <w:lang w:eastAsia="hu-HU"/>
-        </w:rPr>
-        <w:t>pull</w:t>
-      </w:r>
-      <w:proofErr w:type="spellEnd"/>
-      <w:r>
-        <w:rPr>
-          <w:sz w:val="28"/>
-          <w:szCs w:val="28"/>
-          <w:lang w:eastAsia="hu-HU"/>
-        </w:rPr>
-        <w:t xml:space="preserve"> </w:t>
-      </w:r>
-      <w:proofErr w:type="spellStart"/>
-      <w:r>
-        <w:rPr>
-          <w:sz w:val="28"/>
-          <w:szCs w:val="28"/>
-          <w:lang w:eastAsia="hu-HU"/>
-        </w:rPr>
-        <w:t>requestek</w:t>
-      </w:r>
-      <w:proofErr w:type="spellEnd"/>
-      <w:r>
-        <w:rPr>
-          <w:sz w:val="28"/>
-          <w:szCs w:val="28"/>
-          <w:lang w:eastAsia="hu-HU"/>
-        </w:rPr>
-        <w:t xml:space="preserve">" létrehozását is, amelyek segítségével a fejlesztők javasolhatják, hogy egy másik fejlesztő kódját integrálják a projektbe. A </w:t>
-      </w:r>
-      <w:proofErr w:type="spellStart"/>
-      <w:r>
-        <w:rPr>
-          <w:sz w:val="28"/>
-          <w:szCs w:val="28"/>
-          <w:lang w:eastAsia="hu-HU"/>
-        </w:rPr>
-        <w:t>pull</w:t>
-      </w:r>
-      <w:proofErr w:type="spellEnd"/>
-      <w:r>
-        <w:rPr>
-          <w:sz w:val="28"/>
-          <w:szCs w:val="28"/>
-          <w:lang w:eastAsia="hu-HU"/>
-        </w:rPr>
-        <w:t xml:space="preserve"> </w:t>
-      </w:r>
-      <w:proofErr w:type="spellStart"/>
-      <w:r>
-        <w:rPr>
-          <w:sz w:val="28"/>
-          <w:szCs w:val="28"/>
-          <w:lang w:eastAsia="hu-HU"/>
-        </w:rPr>
-        <w:t>requestek</w:t>
-      </w:r>
-      <w:proofErr w:type="spellEnd"/>
-      <w:r>
-        <w:rPr>
-          <w:sz w:val="28"/>
-          <w:szCs w:val="28"/>
-          <w:lang w:eastAsia="hu-HU"/>
-        </w:rPr>
-        <w:t xml:space="preserve"> segítenek a kód átvizsgálásában és a hibák észlelésében.</w:t>
-      </w:r>
-    </w:p>
-    <w:p>
-      <w:pPr>
-        <w:rPr>
-          <w:sz w:val="28"/>
-          <w:szCs w:val="28"/>
-        </w:rPr>
-      </w:pPr>
-    </w:p>
-    <w:p>
-      <w:pPr>
-        <w:rPr>
-          <w:sz w:val="28"/>
-          <w:szCs w:val="28"/>
-        </w:rPr>
-      </w:pPr>
-    </w:p>
-    <w:p>
-      <w:pPr>
+        <w:t>.</w:t>
+      </w:r>
+      <w:r>
         <w:rPr>
           <w:b/>
           <w:sz w:val="36"/>
           <w:szCs w:val="36"/>
         </w:rPr>
-      </w:pPr>
+        <w:t>6</w:t>
+      </w:r>
       <w:r>
         <w:rPr>
           <w:b/>
           <w:sz w:val="36"/>
           <w:szCs w:val="36"/>
         </w:rPr>
-        <w:t>2.3 React.js</w:t>
-      </w:r>
-    </w:p>
-    <w:p>
-      <w:pPr>
-        <w:rPr>
-          <w:sz w:val="28"/>
-          <w:szCs w:val="28"/>
-        </w:rPr>
-      </w:pPr>
+        <w:t xml:space="preserve"> </w:t>
+      </w:r>
+      <w:proofErr w:type="spellStart"/>
+      <w:r>
+        <w:rPr>
+          <w:b/>
+          <w:sz w:val="36"/>
+          <w:szCs w:val="36"/>
+        </w:rPr>
+        <w:t>Github</w:t>
+      </w:r>
+      <w:proofErr w:type="spellEnd"/>
+    </w:p>
+    <w:p>
+      <w:pPr>
+        <w:rPr>
+          <w:sz w:val="28"/>
+          <w:szCs w:val="28"/>
+          <w:lang w:eastAsia="hu-HU"/>
+        </w:rPr>
+      </w:pPr>
+      <w:r>
+        <w:rPr>
+          <w:sz w:val="28"/>
+          <w:szCs w:val="28"/>
+          <w:lang w:eastAsia="hu-HU"/>
+        </w:rPr>
+        <w:t xml:space="preserve">A GitHub egy online platform, amely lehetővé teszi a programozók és fejlesztők számára, hogy kódot tároljanak, megosszák és együtt dolgozzanak. A GitHub alapja a </w:t>
+      </w:r>
+      <w:proofErr w:type="spellStart"/>
+      <w:r>
+        <w:rPr>
+          <w:sz w:val="28"/>
+          <w:szCs w:val="28"/>
+          <w:lang w:eastAsia="hu-HU"/>
+        </w:rPr>
+        <w:t>Git</w:t>
+      </w:r>
+      <w:proofErr w:type="spellEnd"/>
+      <w:r>
+        <w:rPr>
+          <w:sz w:val="28"/>
+          <w:szCs w:val="28"/>
+          <w:lang w:eastAsia="hu-HU"/>
+        </w:rPr>
+        <w:t xml:space="preserve"> verziókezelő rendszer, amely segít a kód módosításainak nyomon követésében. Lehetővé teszi a csapatok számára, hogy könnyen dolgozzanak együtt, bárhol is legyenek, és megoldja a kódban történt változtatások összevonását, valamint a hibák kezelését.</w:t>
+      </w:r>
+    </w:p>
+    <w:p>
+      <w:pPr>
+        <w:rPr>
+          <w:sz w:val="28"/>
+          <w:szCs w:val="28"/>
+          <w:lang w:eastAsia="hu-HU"/>
+        </w:rPr>
+      </w:pPr>
+      <w:r>
+        <w:rPr>
+          <w:sz w:val="28"/>
+          <w:szCs w:val="28"/>
+          <w:lang w:eastAsia="hu-HU"/>
+        </w:rPr>
+        <w:t>A GitHub-</w:t>
+      </w:r>
+      <w:proofErr w:type="spellStart"/>
+      <w:r>
+        <w:rPr>
+          <w:sz w:val="28"/>
+          <w:szCs w:val="28"/>
+          <w:lang w:eastAsia="hu-HU"/>
+        </w:rPr>
+        <w:t>on</w:t>
+      </w:r>
+      <w:proofErr w:type="spellEnd"/>
+      <w:r>
+        <w:rPr>
+          <w:sz w:val="28"/>
+          <w:szCs w:val="28"/>
+          <w:lang w:eastAsia="hu-HU"/>
+        </w:rPr>
+        <w:t xml:space="preserve"> található kódokat "tárházaknak" (</w:t>
+      </w:r>
+      <w:proofErr w:type="spellStart"/>
+      <w:r>
+        <w:rPr>
+          <w:sz w:val="28"/>
+          <w:szCs w:val="28"/>
+          <w:lang w:eastAsia="hu-HU"/>
+        </w:rPr>
+        <w:t>repository</w:t>
+      </w:r>
+      <w:proofErr w:type="spellEnd"/>
+      <w:r>
+        <w:rPr>
+          <w:sz w:val="28"/>
+          <w:szCs w:val="28"/>
+          <w:lang w:eastAsia="hu-HU"/>
+        </w:rPr>
+        <w:t>) hívják, ahol a fejlesztők feltölthetik, módosíthatják és megoszthatják a projektjeiket. A felhasználók különböző jogosultságokkal rendelkezhetnek egy projektben: lehetnek adminisztrátorok, akik teljes hozzáférést kapnak, vagy egyszerű hozzájárulók, akik javaslatokat tehetnek a kód módosítására. A kód frissítéseit és változtatásait "</w:t>
+      </w:r>
+      <w:proofErr w:type="spellStart"/>
+      <w:r>
+        <w:rPr>
+          <w:sz w:val="28"/>
+          <w:szCs w:val="28"/>
+          <w:lang w:eastAsia="hu-HU"/>
+        </w:rPr>
+        <w:t>commiteknek</w:t>
+      </w:r>
+      <w:proofErr w:type="spellEnd"/>
+      <w:r>
+        <w:rPr>
+          <w:sz w:val="28"/>
+          <w:szCs w:val="28"/>
+          <w:lang w:eastAsia="hu-HU"/>
+        </w:rPr>
+        <w:t xml:space="preserve">" nevezik, és minden </w:t>
+      </w:r>
+      <w:proofErr w:type="spellStart"/>
+      <w:r>
+        <w:rPr>
+          <w:sz w:val="28"/>
+          <w:szCs w:val="28"/>
+          <w:lang w:eastAsia="hu-HU"/>
+        </w:rPr>
+        <w:t>commit</w:t>
+      </w:r>
+      <w:proofErr w:type="spellEnd"/>
+      <w:r>
+        <w:rPr>
+          <w:sz w:val="28"/>
+          <w:szCs w:val="28"/>
+          <w:lang w:eastAsia="hu-HU"/>
+        </w:rPr>
+        <w:t>-hoz megjegyzés is tartozik, hogy könnyen követhetők legyenek a módosítások.</w:t>
+      </w:r>
+    </w:p>
+    <w:p>
+      <w:pPr>
+        <w:rPr>
+          <w:lang w:eastAsia="hu-HU"/>
+        </w:rPr>
+      </w:pPr>
+      <w:r>
+        <w:rPr>
+          <w:sz w:val="28"/>
+          <w:szCs w:val="28"/>
+          <w:lang w:eastAsia="hu-HU"/>
+        </w:rPr>
+        <w:t>A GitHub lehetővé teszi a "</w:t>
+      </w:r>
+      <w:proofErr w:type="spellStart"/>
+      <w:r>
+        <w:rPr>
+          <w:sz w:val="28"/>
+          <w:szCs w:val="28"/>
+          <w:lang w:eastAsia="hu-HU"/>
+        </w:rPr>
+        <w:t>pull</w:t>
+      </w:r>
+      <w:proofErr w:type="spellEnd"/>
+      <w:r>
+        <w:rPr>
+          <w:sz w:val="28"/>
+          <w:szCs w:val="28"/>
+          <w:lang w:eastAsia="hu-HU"/>
+        </w:rPr>
+        <w:t xml:space="preserve"> </w:t>
+      </w:r>
+      <w:proofErr w:type="spellStart"/>
+      <w:r>
+        <w:rPr>
+          <w:sz w:val="28"/>
+          <w:szCs w:val="28"/>
+          <w:lang w:eastAsia="hu-HU"/>
+        </w:rPr>
+        <w:t>requestek</w:t>
+      </w:r>
+      <w:proofErr w:type="spellEnd"/>
+      <w:r>
+        <w:rPr>
+          <w:sz w:val="28"/>
+          <w:szCs w:val="28"/>
+          <w:lang w:eastAsia="hu-HU"/>
+        </w:rPr>
+        <w:t xml:space="preserve">" létrehozását is, amelyek segítségével a fejlesztők javasolhatják, hogy egy másik fejlesztő kódját integrálják a projektbe. A </w:t>
+      </w:r>
+      <w:proofErr w:type="spellStart"/>
+      <w:r>
+        <w:rPr>
+          <w:sz w:val="28"/>
+          <w:szCs w:val="28"/>
+          <w:lang w:eastAsia="hu-HU"/>
+        </w:rPr>
+        <w:t>pull</w:t>
+      </w:r>
+      <w:proofErr w:type="spellEnd"/>
+      <w:r>
+        <w:rPr>
+          <w:sz w:val="28"/>
+          <w:szCs w:val="28"/>
+          <w:lang w:eastAsia="hu-HU"/>
+        </w:rPr>
+        <w:t xml:space="preserve"> </w:t>
+      </w:r>
+      <w:proofErr w:type="spellStart"/>
+      <w:r>
+        <w:rPr>
+          <w:sz w:val="28"/>
+          <w:szCs w:val="28"/>
+          <w:lang w:eastAsia="hu-HU"/>
+        </w:rPr>
+        <w:t>requestek</w:t>
+      </w:r>
+      <w:proofErr w:type="spellEnd"/>
+      <w:r>
+        <w:rPr>
+          <w:sz w:val="28"/>
+          <w:szCs w:val="28"/>
+          <w:lang w:eastAsia="hu-HU"/>
+        </w:rPr>
+        <w:t xml:space="preserve"> segítenek a kód átvizsgálásában és a hibák észlelésében.</w:t>
+      </w:r>
+    </w:p>
+    <w:p>
+      <w:pPr>
+        <w:jc w:val="center"/>
+        <w:rPr>
+          <w:sz w:val="28"/>
+          <w:szCs w:val="28"/>
+        </w:rPr>
+      </w:pPr>
+      <w:r>
+        <w:rPr>
+          <w:noProof/>
+        </w:rPr>
+        <w:drawing>
+          <wp:inline distT="0" distB="0" distL="0" distR="0" wp14:anchorId="526F499E" wp14:editId="00D1F950">
+            <wp:extent cx="2819400" cy="1585913"/>
+            <wp:effectExtent l="0" t="0" r="0" b="0"/>
+            <wp:docPr id="280732881" name="Kép 1" descr="React Logo - PNG Logo Vector Brand Downloads (SVG, EPS)"/>
+            <wp:cNvGraphicFramePr>
+              <a:graphicFrameLocks xmlns:a="http://schemas.openxmlformats.org/drawingml/2006/main" noChangeAspect="1"/>
+            </wp:cNvGraphicFramePr>
+            <a:graphic xmlns:a="http://schemas.openxmlformats.org/drawingml/2006/main">
+              <a:graphicData uri="http://schemas.openxmlformats.org/drawingml/2006/picture">
+                <pic:pic xmlns:pic="http://schemas.openxmlformats.org/drawingml/2006/picture">
+                  <pic:nvPicPr>
+                    <pic:cNvPr id="0" name="Picture 1" descr="React Logo - PNG Logo Vector Brand Downloads (SVG, EPS)"/>
+                    <pic:cNvPicPr>
+                      <a:picLocks noChangeAspect="1" noChangeArrowheads="1"/>
+                    </pic:cNvPicPr>
+                  </pic:nvPicPr>
+                  <pic:blipFill>
+                    <a:blip r:embed="rId10" cstate="print">
+                      <a:extLst>
+                        <a:ext uri="{28A0092B-C50C-407E-A947-70E740481C1C}">
+                          <a14:useLocalDpi xmlns:a14="http://schemas.microsoft.com/office/drawing/2010/main" val="0"/>
+                        </a:ext>
+                      </a:extLst>
+                    </a:blip>
+                    <a:srcRect/>
+                    <a:stretch>
+                      <a:fillRect/>
+                    </a:stretch>
+                  </pic:blipFill>
+                  <pic:spPr bwMode="auto">
+                    <a:xfrm>
+                      <a:off x="0" y="0"/>
+                      <a:ext cx="2833493" cy="1593841"/>
+                    </a:xfrm>
+                    <a:prstGeom prst="rect">
+                      <a:avLst/>
+                    </a:prstGeom>
+                    <a:noFill/>
+                    <a:ln>
+                      <a:noFill/>
+                    </a:ln>
+                  </pic:spPr>
+                </pic:pic>
+              </a:graphicData>
+            </a:graphic>
+          </wp:inline>
+        </w:drawing>
+      </w:r>
+    </w:p>
+    <w:p>
+      <w:pPr>
+        <w:rPr>
+          <w:b/>
+          <w:sz w:val="36"/>
+          <w:szCs w:val="36"/>
+        </w:rPr>
+      </w:pPr>
+      <w:r>
+        <w:rPr>
+          <w:b/>
+          <w:sz w:val="36"/>
+          <w:szCs w:val="36"/>
+        </w:rPr>
+        <w:t>1</w:t>
+      </w:r>
+      <w:r>
+        <w:rPr>
+          <w:b/>
+          <w:sz w:val="36"/>
+          <w:szCs w:val="36"/>
+        </w:rPr>
+        <w:t>.</w:t>
+      </w:r>
+      <w:r>
+        <w:rPr>
+          <w:b/>
+          <w:sz w:val="36"/>
+          <w:szCs w:val="36"/>
+        </w:rPr>
+        <w:t>7</w:t>
+      </w:r>
+      <w:r>
+        <w:rPr>
+          <w:b/>
+          <w:sz w:val="36"/>
+          <w:szCs w:val="36"/>
+        </w:rPr>
+        <w:t xml:space="preserve"> React.js</w:t>
+      </w:r>
+    </w:p>
+    <w:p>
+      <w:pPr>
+        <w:jc w:val="center"/>
+        <w:rPr>
+          <w:sz w:val="28"/>
+          <w:szCs w:val="28"/>
+        </w:rPr>
+      </w:pPr>
+      <w:r>
+        <w:rPr>
+          <w:sz w:val="28"/>
+          <w:szCs w:val="28"/>
+        </w:rPr>
+        <w:lastRenderedPageBreak/>
+        <w:t>s</w:t>
+      </w:r>
     </w:p>
     <w:p>
       <w:pPr>
@@ -1617,12 +2175,6 @@
       </w:r>
     </w:p>
     <w:p>
-      <w:pPr>
-        <w:rPr>
-          <w:sz w:val="28"/>
-          <w:szCs w:val="28"/>
-        </w:rPr>
-      </w:pPr>
       <w:r>
         <w:rPr>
           <w:sz w:val="28"/>
@@ -1644,15 +2196,7 @@
           <w:sz w:val="28"/>
           <w:szCs w:val="28"/>
         </w:rPr>
-        <w:t xml:space="preserve">, amelyek kisebb, újrahasznosítható részek. Minden komponens önállóan működik, saját </w:t>
-      </w:r>
-      <w:r>
-        <w:rPr>
-          <w:sz w:val="28"/>
-          <w:szCs w:val="28"/>
-        </w:rPr>
-        <w:lastRenderedPageBreak/>
-        <w:t>adatokkal (</w:t>
+        <w:t>, amelyek kisebb, újrahasznosítható részek. Minden komponens önállóan működik, saját adatokkal (</w:t>
       </w:r>
       <w:proofErr w:type="spellStart"/>
       <w:r>
@@ -1670,6 +2214,11 @@
         </w:rPr>
         <w:t>) és viselkedéssel. Ez lehetővé teszi, hogy könnyebben kezelhető és karbantartható legyen a kód.</w:t>
       </w:r>
+    </w:p>
+    <w:p>
+      <w:pPr>
+        <w:jc w:val="center"/>
+      </w:pPr>
     </w:p>
     <w:p>
       <w:pPr>
@@ -1701,7 +2250,7 @@
           <w:sz w:val="36"/>
           <w:szCs w:val="36"/>
         </w:rPr>
-        <w:t xml:space="preserve">2.4 </w:t>
+        <w:t>1</w:t>
       </w:r>
       <w:r>
         <w:rPr>
@@ -1709,15 +2258,39 @@
           <w:sz w:val="36"/>
           <w:szCs w:val="36"/>
         </w:rPr>
-        <w:t xml:space="preserve">ASP.NET Web </w:t>
-      </w:r>
-      <w:proofErr w:type="spellStart"/>
+        <w:t>.</w:t>
+      </w:r>
       <w:r>
         <w:rPr>
           <w:b/>
           <w:sz w:val="36"/>
           <w:szCs w:val="36"/>
         </w:rPr>
+        <w:t>8</w:t>
+      </w:r>
+      <w:r>
+        <w:rPr>
+          <w:b/>
+          <w:sz w:val="36"/>
+          <w:szCs w:val="36"/>
+        </w:rPr>
+        <w:t xml:space="preserve"> </w:t>
+      </w:r>
+      <w:r>
+        <w:rPr>
+          <w:b/>
+          <w:sz w:val="36"/>
+          <w:szCs w:val="36"/>
+        </w:rPr>
+        <w:t xml:space="preserve">ASP.NET Web </w:t>
+      </w:r>
+      <w:proofErr w:type="spellStart"/>
+      <w:r>
+        <w:rPr>
+          <w:b/>
+          <w:sz w:val="36"/>
+          <w:szCs w:val="36"/>
+        </w:rPr>
         <w:t>Api</w:t>
       </w:r>
       <w:proofErr w:type="spellEnd"/>
@@ -1766,7 +2339,57 @@
           <w:sz w:val="28"/>
           <w:szCs w:val="28"/>
         </w:rPr>
-        <w:t xml:space="preserve"> API-k fejlesztését. A Web API segítségével egyszerűen hozhatsz létre HTTP-alapú szolgáltatásokat, amelyek JSON vagy XML formátumban küldenek és fogadnak adatokat. A C# erejét kihasználva könnyen </w:t>
+        <w:t xml:space="preserve"> API-k fejlesztését. A Web API segítségével egyszerűen hozhatsz létre HTTP-alapú szolgáltatásokat, amelyek JSON vagy XML formátumban küldenek és fogadnak adatokat. A C# erejét kihasználva könnyen írhatóak a logika, a kontroller osztályok, és az útvonaltérkép, amelyek meghatározzák, hogyan kezelje az alkalmazás a beérkező kéréseket.</w:t>
+      </w:r>
+    </w:p>
+    <w:p>
+      <w:pPr>
+        <w:rPr>
+          <w:sz w:val="28"/>
+          <w:szCs w:val="28"/>
+        </w:rPr>
+      </w:pPr>
+    </w:p>
+    <w:p>
+      <w:pPr>
+        <w:rPr>
+          <w:sz w:val="28"/>
+          <w:szCs w:val="28"/>
+        </w:rPr>
+      </w:pPr>
+    </w:p>
+    <w:p>
+      <w:pPr>
+        <w:rPr>
+          <w:b/>
+          <w:bCs/>
+          <w:sz w:val="36"/>
+          <w:szCs w:val="36"/>
+        </w:rPr>
+      </w:pPr>
+      <w:r>
+        <w:rPr>
+          <w:b/>
+          <w:bCs/>
+          <w:sz w:val="36"/>
+          <w:szCs w:val="36"/>
+        </w:rPr>
+        <w:t>1.9 HTML</w:t>
+      </w:r>
+    </w:p>
+    <w:p>
+      <w:pPr>
+        <w:rPr>
+          <w:sz w:val="28"/>
+          <w:szCs w:val="28"/>
+        </w:rPr>
+      </w:pPr>
+      <w:r>
+        <w:rPr>
+          <w:sz w:val="28"/>
+          <w:szCs w:val="28"/>
+        </w:rPr>
+        <w:t>A HTML (</w:t>
       </w:r>
       <w:proofErr w:type="spellStart"/>
       <w:r>
@@ -1774,7 +2397,7 @@
           <w:sz w:val="28"/>
           <w:szCs w:val="28"/>
         </w:rPr>
-        <w:t>írhatóak</w:t>
+        <w:t>HyperText</w:t>
       </w:r>
       <w:proofErr w:type="spellEnd"/>
       <w:r>
@@ -1782,7 +2405,408 @@
           <w:sz w:val="28"/>
           <w:szCs w:val="28"/>
         </w:rPr>
-        <w:t xml:space="preserve"> a logika, a kontroller osztályok, és az útvonaltérkép, amelyek meghatározzák, hogyan kezelje az alkalmazás a beérkező kéréseket.</w:t>
+        <w:t xml:space="preserve"> </w:t>
+      </w:r>
+      <w:proofErr w:type="spellStart"/>
+      <w:r>
+        <w:rPr>
+          <w:sz w:val="28"/>
+          <w:szCs w:val="28"/>
+        </w:rPr>
+        <w:t>Markup</w:t>
+      </w:r>
+      <w:proofErr w:type="spellEnd"/>
+      <w:r>
+        <w:rPr>
+          <w:sz w:val="28"/>
+          <w:szCs w:val="28"/>
+        </w:rPr>
+        <w:t xml:space="preserve"> </w:t>
+      </w:r>
+      <w:proofErr w:type="spellStart"/>
+      <w:r>
+        <w:rPr>
+          <w:sz w:val="28"/>
+          <w:szCs w:val="28"/>
+        </w:rPr>
+        <w:t>Language</w:t>
+      </w:r>
+      <w:proofErr w:type="spellEnd"/>
+      <w:r>
+        <w:rPr>
+          <w:sz w:val="28"/>
+          <w:szCs w:val="28"/>
+        </w:rPr>
+        <w:t xml:space="preserve">) a weboldalak szerkezetét és tartalmát meghatározó jelölőnyelv, amely tagekből épül fel. Hierarchikus felépítésű, a dokumentum </w:t>
+      </w:r>
+      <w:proofErr w:type="spellStart"/>
+      <w:r>
+        <w:rPr>
+          <w:sz w:val="28"/>
+          <w:szCs w:val="28"/>
+        </w:rPr>
+        <w:t>metaadatokat</w:t>
+      </w:r>
+      <w:proofErr w:type="spellEnd"/>
+      <w:r>
+        <w:rPr>
+          <w:sz w:val="28"/>
+          <w:szCs w:val="28"/>
+        </w:rPr>
+        <w:t xml:space="preserve"> és vizuális elemeket is tartalmaz. A HTML5 új szerkezeti elemeket, natív multimédiás támogatást és fejlettebb űrlapkezelést biztosít. </w:t>
+      </w:r>
+      <w:proofErr w:type="spellStart"/>
+      <w:r>
+        <w:rPr>
+          <w:sz w:val="28"/>
+          <w:szCs w:val="28"/>
+        </w:rPr>
+        <w:t>Reszponzivitása</w:t>
+      </w:r>
+      <w:proofErr w:type="spellEnd"/>
+      <w:r>
+        <w:rPr>
+          <w:sz w:val="28"/>
+          <w:szCs w:val="28"/>
+        </w:rPr>
+        <w:t xml:space="preserve"> CSS és JavaScript segítségével alakítható, lehetővé téve az interaktív és dinamikus weboldalak fejlesztését.</w:t>
+      </w:r>
+    </w:p>
+    <w:p>
+      <w:pPr>
+        <w:rPr>
+          <w:sz w:val="28"/>
+          <w:szCs w:val="28"/>
+        </w:rPr>
+      </w:pPr>
+    </w:p>
+    <w:p>
+      <w:pPr>
+        <w:rPr>
+          <w:sz w:val="28"/>
+          <w:szCs w:val="28"/>
+        </w:rPr>
+      </w:pPr>
+    </w:p>
+    <w:p>
+      <w:pPr>
+        <w:rPr>
+          <w:b/>
+          <w:bCs/>
+          <w:sz w:val="36"/>
+          <w:szCs w:val="36"/>
+        </w:rPr>
+      </w:pPr>
+      <w:r>
+        <w:rPr>
+          <w:b/>
+          <w:bCs/>
+          <w:sz w:val="36"/>
+          <w:szCs w:val="36"/>
+        </w:rPr>
+        <w:t>1.10 CSS</w:t>
+      </w:r>
+    </w:p>
+    <w:p>
+      <w:pPr>
+        <w:rPr>
+          <w:sz w:val="28"/>
+          <w:szCs w:val="28"/>
+        </w:rPr>
+      </w:pPr>
+      <w:r>
+        <w:rPr>
+          <w:sz w:val="28"/>
+          <w:szCs w:val="28"/>
+        </w:rPr>
+        <w:t>A CSS (</w:t>
+      </w:r>
+      <w:proofErr w:type="spellStart"/>
+      <w:r>
+        <w:rPr>
+          <w:sz w:val="28"/>
+          <w:szCs w:val="28"/>
+        </w:rPr>
+        <w:t>Cascading</w:t>
+      </w:r>
+      <w:proofErr w:type="spellEnd"/>
+      <w:r>
+        <w:rPr>
+          <w:sz w:val="28"/>
+          <w:szCs w:val="28"/>
+        </w:rPr>
+        <w:t xml:space="preserve"> </w:t>
+      </w:r>
+      <w:proofErr w:type="spellStart"/>
+      <w:r>
+        <w:rPr>
+          <w:sz w:val="28"/>
+          <w:szCs w:val="28"/>
+        </w:rPr>
+        <w:t>Style</w:t>
+      </w:r>
+      <w:proofErr w:type="spellEnd"/>
+      <w:r>
+        <w:rPr>
+          <w:sz w:val="28"/>
+          <w:szCs w:val="28"/>
+        </w:rPr>
+        <w:t xml:space="preserve"> </w:t>
+      </w:r>
+      <w:proofErr w:type="spellStart"/>
+      <w:r>
+        <w:rPr>
+          <w:sz w:val="28"/>
+          <w:szCs w:val="28"/>
+        </w:rPr>
+        <w:t>Sheets</w:t>
+      </w:r>
+      <w:proofErr w:type="spellEnd"/>
+      <w:r>
+        <w:rPr>
+          <w:sz w:val="28"/>
+          <w:szCs w:val="28"/>
+        </w:rPr>
+        <w:t xml:space="preserve">) a weboldalak megjelenését és formázását szabályozó nyelv. Lehetővé teszi az elemek színezését, méretezését, pozicionálását és animációját. A stílusokat szelektorok segítségével lehet alkalmazni, külső, belső vagy </w:t>
+      </w:r>
+      <w:proofErr w:type="spellStart"/>
+      <w:r>
+        <w:rPr>
+          <w:sz w:val="28"/>
+          <w:szCs w:val="28"/>
+        </w:rPr>
+        <w:t>inline</w:t>
+      </w:r>
+      <w:proofErr w:type="spellEnd"/>
+      <w:r>
+        <w:rPr>
+          <w:sz w:val="28"/>
+          <w:szCs w:val="28"/>
+        </w:rPr>
+        <w:t xml:space="preserve"> módon. A CSS3 új lehetőségeket hozott, például rugalmas elrendezéseket, árnyékokat, áttűnéseket és reszponzív design támogatást.</w:t>
+      </w:r>
+    </w:p>
+    <w:p>
+      <w:pPr>
+        <w:jc w:val="center"/>
+      </w:pPr>
+      <w:r>
+        <w:t>7</w:t>
+      </w:r>
+    </w:p>
+    <w:p>
+      <w:pPr>
+        <w:rPr>
+          <w:b/>
+          <w:bCs/>
+          <w:sz w:val="36"/>
+          <w:szCs w:val="36"/>
+        </w:rPr>
+      </w:pPr>
+      <w:r>
+        <w:rPr>
+          <w:b/>
+          <w:bCs/>
+          <w:sz w:val="36"/>
+          <w:szCs w:val="36"/>
+        </w:rPr>
+        <w:t xml:space="preserve">1.11 </w:t>
+      </w:r>
+      <w:proofErr w:type="spellStart"/>
+      <w:r>
+        <w:rPr>
+          <w:b/>
+          <w:bCs/>
+          <w:sz w:val="36"/>
+          <w:szCs w:val="36"/>
+        </w:rPr>
+        <w:t>Javascript</w:t>
+      </w:r>
+      <w:proofErr w:type="spellEnd"/>
+    </w:p>
+    <w:p>
+      <w:pPr>
+        <w:rPr>
+          <w:sz w:val="28"/>
+          <w:szCs w:val="28"/>
+        </w:rPr>
+      </w:pPr>
+      <w:r>
+        <w:rPr>
+          <w:sz w:val="28"/>
+          <w:szCs w:val="28"/>
+        </w:rPr>
+        <w:t>A JavaScript egy dinamikus, magas szintű programozási nyelv, amely interaktivitást és funkcionalitást ad a weboldalakhoz. Képes DOM-manipulációra, eseménykezelésre, animációkra és aszinkron műveletekre. Böngészőkben natívan fut, de Node.js segítségével szerveroldalon is használható. A modern JavaScript támogatja az ES6+ szintaxist, modulkezelést és API-integrációkat, megkönnyítve a reszponzív és dinamikus webalkalmazások fejlesztését.</w:t>
+      </w:r>
+    </w:p>
+    <w:p>
+      <w:pPr>
+        <w:rPr>
+          <w:sz w:val="28"/>
+          <w:szCs w:val="28"/>
+        </w:rPr>
+      </w:pPr>
+    </w:p>
+    <w:p>
+      <w:pPr>
+        <w:rPr>
+          <w:sz w:val="28"/>
+          <w:szCs w:val="28"/>
+        </w:rPr>
+      </w:pPr>
+    </w:p>
+    <w:p>
+      <w:pPr>
+        <w:rPr>
+          <w:b/>
+          <w:bCs/>
+          <w:sz w:val="36"/>
+          <w:szCs w:val="36"/>
+        </w:rPr>
+      </w:pPr>
+      <w:r>
+        <w:rPr>
+          <w:b/>
+          <w:bCs/>
+          <w:sz w:val="36"/>
+          <w:szCs w:val="36"/>
+        </w:rPr>
+        <w:t xml:space="preserve">1.12 </w:t>
+      </w:r>
+      <w:proofErr w:type="spellStart"/>
+      <w:r>
+        <w:rPr>
+          <w:b/>
+          <w:bCs/>
+          <w:sz w:val="36"/>
+          <w:szCs w:val="36"/>
+        </w:rPr>
+        <w:t>Bootstrap</w:t>
+      </w:r>
+      <w:proofErr w:type="spellEnd"/>
+    </w:p>
+    <w:p>
+      <w:pPr>
+        <w:rPr>
+          <w:sz w:val="28"/>
+          <w:szCs w:val="28"/>
+        </w:rPr>
+      </w:pPr>
+      <w:r>
+        <w:rPr>
+          <w:sz w:val="28"/>
+          <w:szCs w:val="28"/>
+        </w:rPr>
+        <w:t xml:space="preserve">A </w:t>
+      </w:r>
+      <w:proofErr w:type="spellStart"/>
+      <w:r>
+        <w:rPr>
+          <w:sz w:val="28"/>
+          <w:szCs w:val="28"/>
+        </w:rPr>
+        <w:t>Bootstrap</w:t>
+      </w:r>
+      <w:proofErr w:type="spellEnd"/>
+      <w:r>
+        <w:rPr>
+          <w:sz w:val="28"/>
+          <w:szCs w:val="28"/>
+        </w:rPr>
+        <w:t xml:space="preserve"> egy nyílt forráskódú CSS keretrendszer, amely megkönnyíti a reszponzív és modern weboldalak fejlesztését. Tartalmaz előre definiált rácsrendszert, komponenseket és stílusokat, amelyeket CSS és JavaScript segítségével lehet testre szabni. Mobilbarát kialakításra optimalizált, és natív támogatást nyújt gombokhoz, űrlapokhoz, navigációhoz és modális ablakokhoz.</w:t>
+      </w:r>
+    </w:p>
+    <w:p>
+      <w:pPr>
+        <w:rPr>
+          <w:sz w:val="28"/>
+          <w:szCs w:val="28"/>
+        </w:rPr>
+      </w:pPr>
+    </w:p>
+    <w:p>
+      <w:pPr>
+        <w:rPr>
+          <w:sz w:val="28"/>
+          <w:szCs w:val="28"/>
+        </w:rPr>
+      </w:pPr>
+    </w:p>
+    <w:p>
+      <w:pPr>
+        <w:rPr>
+          <w:b/>
+          <w:bCs/>
+          <w:sz w:val="36"/>
+          <w:szCs w:val="36"/>
+        </w:rPr>
+      </w:pPr>
+      <w:r>
+        <w:rPr>
+          <w:b/>
+          <w:bCs/>
+          <w:sz w:val="36"/>
+          <w:szCs w:val="36"/>
+        </w:rPr>
+        <w:t>1.1</w:t>
+      </w:r>
+      <w:r>
+        <w:rPr>
+          <w:b/>
+          <w:bCs/>
+          <w:sz w:val="36"/>
+          <w:szCs w:val="36"/>
+        </w:rPr>
+        <w:t>3</w:t>
+      </w:r>
+      <w:r>
+        <w:rPr>
+          <w:b/>
+          <w:bCs/>
+          <w:sz w:val="36"/>
+          <w:szCs w:val="36"/>
+        </w:rPr>
+        <w:t xml:space="preserve"> C#</w:t>
+      </w:r>
+    </w:p>
+    <w:p>
+      <w:pPr>
+        <w:rPr>
+          <w:sz w:val="28"/>
+          <w:szCs w:val="28"/>
+        </w:rPr>
+      </w:pPr>
+      <w:r>
+        <w:rPr>
+          <w:sz w:val="28"/>
+          <w:szCs w:val="28"/>
+        </w:rPr>
+        <w:lastRenderedPageBreak/>
+        <w:t>A C# egy objektumorientált, típusosan erős programozási nyelv, amelyet a Microsoft fejlesztett ki. Főként .NET környezetben használják asztali, webes és mobilalkalmazások fejlesztésére. Támogatja az öröklődést, polimorfizmust, aszinkron programozást és LINQ-alapú adatkezelést. Modern szintaxisa és gazdag standard könyvtára megkönnyíti a hatékony és biztonságos alkalmazásfejlesztést.</w:t>
+      </w:r>
+    </w:p>
+    <w:p>
+      <w:pPr>
+        <w:rPr>
+          <w:sz w:val="28"/>
+          <w:szCs w:val="28"/>
+        </w:rPr>
+      </w:pPr>
+    </w:p>
+    <w:p>
+      <w:pPr>
+        <w:rPr>
+          <w:sz w:val="28"/>
+          <w:szCs w:val="28"/>
+        </w:rPr>
+      </w:pPr>
+    </w:p>
+    <w:p>
+      <w:pPr>
+        <w:jc w:val="center"/>
+      </w:pPr>
+      <w:r>
+        <w:t>8</w:t>
       </w:r>
     </w:p>
     <w:p>
@@ -1830,6 +2854,7 @@
       </w:pPr>
     </w:p>
     <w:sectPr>
+      <w:headerReference w:type="default" r:id="rId11"/>
       <w:pgSz w:w="11906" w:h="16838"/>
       <w:pgMar w:top="1417" w:right="1417" w:bottom="1417" w:left="1417" w:header="708" w:footer="708" w:gutter="0"/>
       <w:cols w:space="708"/>
@@ -1839,8 +2864,69 @@
 </w:document>
 </file>
 
+<file path=word/endnotes.xml><?xml version="1.0" encoding="utf-8"?>
+<w:endnotes xmlns:wpc="http://schemas.microsoft.com/office/word/2010/wordprocessingCanvas" xmlns:cx="http://schemas.microsoft.com/office/drawing/2014/chartex" xmlns:cx1="http://schemas.microsoft.com/office/drawing/2015/9/8/chartex" xmlns:cx2="http://schemas.microsoft.com/office/drawing/2015/10/21/chartex" xmlns:cx3="http://schemas.microsoft.com/office/drawing/2016/5/9/chartex" xmlns:cx4="http://schemas.microsoft.com/office/drawing/2016/5/10/chartex" xmlns:cx5="http://schemas.microsoft.com/office/drawing/2016/5/11/chartex" xmlns:cx6="http://schemas.microsoft.com/office/drawing/2016/5/12/chartex" xmlns:cx7="http://schemas.microsoft.com/office/drawing/2016/5/13/chartex" xmlns:cx8="http://schemas.microsoft.com/office/drawing/2016/5/14/chartex" xmlns:mc="http://schemas.openxmlformats.org/markup-compatibility/2006" xmlns:aink="http://schemas.microsoft.com/office/drawing/2016/ink" xmlns:am3d="http://schemas.microsoft.com/office/drawing/2017/model3d" xmlns:o="urn:schemas-microsoft-com:office:office" xmlns:oel="http://schemas.microsoft.com/office/2019/extlst" xmlns:r="http://schemas.openxmlformats.org/officeDocument/2006/relationships" xmlns:m="http://schemas.openxmlformats.org/officeDocument/2006/math" xmlns:v="urn:schemas-microsoft-com:vml" xmlns:wp14="http://schemas.microsoft.com/office/word/2010/wordprocessingDrawing" xmlns:wp="http://schemas.openxmlformats.org/drawingml/2006/wordprocessingDrawing" xmlns:w10="urn:schemas-microsoft-com:office:word" xmlns:w="http://schemas.openxmlformats.org/wordprocessingml/2006/main" xmlns:w14="http://schemas.microsoft.com/office/word/2010/wordml" xmlns:w15="http://schemas.microsoft.com/office/word/2012/wordml" xmlns:w16cex="http://schemas.microsoft.com/office/word/2018/wordml/cex" xmlns:w16cid="http://schemas.microsoft.com/office/word/2016/wordml/cid" xmlns:w16="http://schemas.microsoft.com/office/word/2018/wordml" xmlns:w16du="http://schemas.microsoft.com/office/word/2023/wordml/word16du" xmlns:w16sdtdh="http://schemas.microsoft.com/office/word/2020/wordml/sdtdatahash" xmlns:w16sdtfl="http://schemas.microsoft.com/office/word/2024/wordml/sdtformatlock" xmlns:w16se="http://schemas.microsoft.com/office/word/2015/wordml/symex" xmlns:wpg="http://schemas.microsoft.com/office/word/2010/wordprocessingGroup" xmlns:wpi="http://schemas.microsoft.com/office/word/2010/wordprocessingInk" xmlns:wne="http://schemas.microsoft.com/office/word/2006/wordml" xmlns:wps="http://schemas.microsoft.com/office/word/2010/wordprocessingShape" mc:Ignorable="w14 w15 w16se w16cid w16 w16cex w16sdtdh w16sdtfl w16du wp14">
+  <w:endnote w:type="separator" w:id="-1">
+    <w:p>
+      <w:pPr>
+        <w:spacing w:after="0" w:line="240" w:lineRule="auto"/>
+      </w:pPr>
+      <w:r>
+        <w:separator/>
+      </w:r>
+    </w:p>
+  </w:endnote>
+  <w:endnote w:type="continuationSeparator" w:id="0">
+    <w:p>
+      <w:pPr>
+        <w:spacing w:after="0" w:line="240" w:lineRule="auto"/>
+      </w:pPr>
+      <w:r>
+        <w:continuationSeparator/>
+      </w:r>
+    </w:p>
+  </w:endnote>
+</w:endnotes>
+</file>
+
+<file path=word/footnotes.xml><?xml version="1.0" encoding="utf-8"?>
+<w:footnotes xmlns:wpc="http://schemas.microsoft.com/office/word/2010/wordprocessingCanvas" xmlns:cx="http://schemas.microsoft.com/office/drawing/2014/chartex" xmlns:cx1="http://schemas.microsoft.com/office/drawing/2015/9/8/chartex" xmlns:cx2="http://schemas.microsoft.com/office/drawing/2015/10/21/chartex" xmlns:cx3="http://schemas.microsoft.com/office/drawing/2016/5/9/chartex" xmlns:cx4="http://schemas.microsoft.com/office/drawing/2016/5/10/chartex" xmlns:cx5="http://schemas.microsoft.com/office/drawing/2016/5/11/chartex" xmlns:cx6="http://schemas.microsoft.com/office/drawing/2016/5/12/chartex" xmlns:cx7="http://schemas.microsoft.com/office/drawing/2016/5/13/chartex" xmlns:cx8="http://schemas.microsoft.com/office/drawing/2016/5/14/chartex" xmlns:mc="http://schemas.openxmlformats.org/markup-compatibility/2006" xmlns:aink="http://schemas.microsoft.com/office/drawing/2016/ink" xmlns:am3d="http://schemas.microsoft.com/office/drawing/2017/model3d" xmlns:o="urn:schemas-microsoft-com:office:office" xmlns:oel="http://schemas.microsoft.com/office/2019/extlst" xmlns:r="http://schemas.openxmlformats.org/officeDocument/2006/relationships" xmlns:m="http://schemas.openxmlformats.org/officeDocument/2006/math" xmlns:v="urn:schemas-microsoft-com:vml" xmlns:wp14="http://schemas.microsoft.com/office/word/2010/wordprocessingDrawing" xmlns:wp="http://schemas.openxmlformats.org/drawingml/2006/wordprocessingDrawing" xmlns:w10="urn:schemas-microsoft-com:office:word" xmlns:w="http://schemas.openxmlformats.org/wordprocessingml/2006/main" xmlns:w14="http://schemas.microsoft.com/office/word/2010/wordml" xmlns:w15="http://schemas.microsoft.com/office/word/2012/wordml" xmlns:w16cex="http://schemas.microsoft.com/office/word/2018/wordml/cex" xmlns:w16cid="http://schemas.microsoft.com/office/word/2016/wordml/cid" xmlns:w16="http://schemas.microsoft.com/office/word/2018/wordml" xmlns:w16du="http://schemas.microsoft.com/office/word/2023/wordml/word16du" xmlns:w16sdtdh="http://schemas.microsoft.com/office/word/2020/wordml/sdtdatahash" xmlns:w16sdtfl="http://schemas.microsoft.com/office/word/2024/wordml/sdtformatlock" xmlns:w16se="http://schemas.microsoft.com/office/word/2015/wordml/symex" xmlns:wpg="http://schemas.microsoft.com/office/word/2010/wordprocessingGroup" xmlns:wpi="http://schemas.microsoft.com/office/word/2010/wordprocessingInk" xmlns:wne="http://schemas.microsoft.com/office/word/2006/wordml" xmlns:wps="http://schemas.microsoft.com/office/word/2010/wordprocessingShape" mc:Ignorable="w14 w15 w16se w16cid w16 w16cex w16sdtdh w16sdtfl w16du wp14">
+  <w:footnote w:type="separator" w:id="-1">
+    <w:p>
+      <w:pPr>
+        <w:spacing w:after="0" w:line="240" w:lineRule="auto"/>
+      </w:pPr>
+      <w:r>
+        <w:separator/>
+      </w:r>
+    </w:p>
+  </w:footnote>
+  <w:footnote w:type="continuationSeparator" w:id="0">
+    <w:p>
+      <w:pPr>
+        <w:spacing w:after="0" w:line="240" w:lineRule="auto"/>
+      </w:pPr>
+      <w:r>
+        <w:continuationSeparator/>
+      </w:r>
+    </w:p>
+  </w:footnote>
+</w:footnotes>
+</file>
+
+<file path=word/header1.xml><?xml version="1.0" encoding="utf-8"?>
+<w:hdr xmlns:wpc="http://schemas.microsoft.com/office/word/2010/wordprocessingCanvas" xmlns:cx="http://schemas.microsoft.com/office/drawing/2014/chartex" xmlns:cx1="http://schemas.microsoft.com/office/drawing/2015/9/8/chartex" xmlns:cx2="http://schemas.microsoft.com/office/drawing/2015/10/21/chartex" xmlns:cx3="http://schemas.microsoft.com/office/drawing/2016/5/9/chartex" xmlns:cx4="http://schemas.microsoft.com/office/drawing/2016/5/10/chartex" xmlns:cx5="http://schemas.microsoft.com/office/drawing/2016/5/11/chartex" xmlns:cx6="http://schemas.microsoft.com/office/drawing/2016/5/12/chartex" xmlns:cx7="http://schemas.microsoft.com/office/drawing/2016/5/13/chartex" xmlns:cx8="http://schemas.microsoft.com/office/drawing/2016/5/14/chartex" xmlns:mc="http://schemas.openxmlformats.org/markup-compatibility/2006" xmlns:aink="http://schemas.microsoft.com/office/drawing/2016/ink" xmlns:am3d="http://schemas.microsoft.com/office/drawing/2017/model3d" xmlns:o="urn:schemas-microsoft-com:office:office" xmlns:oel="http://schemas.microsoft.com/office/2019/extlst" xmlns:r="http://schemas.openxmlformats.org/officeDocument/2006/relationships" xmlns:m="http://schemas.openxmlformats.org/officeDocument/2006/math" xmlns:v="urn:schemas-microsoft-com:vml" xmlns:wp14="http://schemas.microsoft.com/office/word/2010/wordprocessingDrawing" xmlns:wp="http://schemas.openxmlformats.org/drawingml/2006/wordprocessingDrawing" xmlns:w10="urn:schemas-microsoft-com:office:word" xmlns:w="http://schemas.openxmlformats.org/wordprocessingml/2006/main" xmlns:w14="http://schemas.microsoft.com/office/word/2010/wordml" xmlns:w15="http://schemas.microsoft.com/office/word/2012/wordml" xmlns:w16cex="http://schemas.microsoft.com/office/word/2018/wordml/cex" xmlns:w16cid="http://schemas.microsoft.com/office/word/2016/wordml/cid" xmlns:w16="http://schemas.microsoft.com/office/word/2018/wordml" xmlns:w16du="http://schemas.microsoft.com/office/word/2023/wordml/word16du" xmlns:w16sdtdh="http://schemas.microsoft.com/office/word/2020/wordml/sdtdatahash" xmlns:w16sdtfl="http://schemas.microsoft.com/office/word/2024/wordml/sdtformatlock" xmlns:w16se="http://schemas.microsoft.com/office/word/2015/wordml/symex" xmlns:wpg="http://schemas.microsoft.com/office/word/2010/wordprocessingGroup" xmlns:wpi="http://schemas.microsoft.com/office/word/2010/wordprocessingInk" xmlns:wne="http://schemas.microsoft.com/office/word/2006/wordml" xmlns:wps="http://schemas.microsoft.com/office/word/2010/wordprocessingShape" mc:Ignorable="w14 w15 w16se w16cid w16 w16cex w16sdtdh w16sdtfl w16du wp14">
+  <w:p>
+    <w:pPr>
+      <w:pStyle w:val="lfej"/>
+      <w:jc w:val="center"/>
+    </w:pPr>
+  </w:p>
+</w:hdr>
+</file>
+
 <file path=word/numbering.xml><?xml version="1.0" encoding="utf-8"?>
-<w:numbering xmlns:wpc="http://schemas.microsoft.com/office/word/2010/wordprocessingCanvas" xmlns:cx="http://schemas.microsoft.com/office/drawing/2014/chartex" xmlns:cx1="http://schemas.microsoft.com/office/drawing/2015/9/8/chartex" xmlns:cx2="http://schemas.microsoft.com/office/drawing/2015/10/21/chartex" xmlns:cx3="http://schemas.microsoft.com/office/drawing/2016/5/9/chartex" xmlns:cx4="http://schemas.microsoft.com/office/drawing/2016/5/10/chartex" xmlns:cx5="http://schemas.microsoft.com/office/drawing/2016/5/11/chartex" xmlns:cx6="http://schemas.microsoft.com/office/drawing/2016/5/12/chartex" xmlns:cx7="http://schemas.microsoft.com/office/drawing/2016/5/13/chartex" xmlns:cx8="http://schemas.microsoft.com/office/drawing/2016/5/14/chartex" xmlns:mc="http://schemas.openxmlformats.org/markup-compatibility/2006" xmlns:aink="http://schemas.microsoft.com/office/drawing/2016/ink" xmlns:am3d="http://schemas.microsoft.com/office/drawing/2017/model3d" xmlns:o="urn:schemas-microsoft-com:office:office" xmlns:r="http://schemas.openxmlformats.org/officeDocument/2006/relationships" xmlns:m="http://schemas.openxmlformats.org/officeDocument/2006/math" xmlns:v="urn:schemas-microsoft-com:vml" xmlns:wp14="http://schemas.microsoft.com/office/word/2010/wordprocessingDrawing" xmlns:wp="http://schemas.openxmlformats.org/drawingml/2006/wordprocessingDrawing" xmlns:w10="urn:schemas-microsoft-com:office:word" xmlns:w="http://schemas.openxmlformats.org/wordprocessingml/2006/main" xmlns:w14="http://schemas.microsoft.com/office/word/2010/wordml" xmlns:w15="http://schemas.microsoft.com/office/word/2012/wordml" xmlns:w16cid="http://schemas.microsoft.com/office/word/2016/wordml/cid" xmlns:w16se="http://schemas.microsoft.com/office/word/2015/wordml/symex" xmlns:wpg="http://schemas.microsoft.com/office/word/2010/wordprocessingGroup" xmlns:wpi="http://schemas.microsoft.com/office/word/2010/wordprocessingInk" xmlns:wne="http://schemas.microsoft.com/office/word/2006/wordml" xmlns:wps="http://schemas.microsoft.com/office/word/2010/wordprocessingShape" mc:Ignorable="w14 w15 w16se w16cid wp14">
+<w:numbering xmlns:wpc="http://schemas.microsoft.com/office/word/2010/wordprocessingCanvas" xmlns:cx="http://schemas.microsoft.com/office/drawing/2014/chartex" xmlns:cx1="http://schemas.microsoft.com/office/drawing/2015/9/8/chartex" xmlns:cx2="http://schemas.microsoft.com/office/drawing/2015/10/21/chartex" xmlns:cx3="http://schemas.microsoft.com/office/drawing/2016/5/9/chartex" xmlns:cx4="http://schemas.microsoft.com/office/drawing/2016/5/10/chartex" xmlns:cx5="http://schemas.microsoft.com/office/drawing/2016/5/11/chartex" xmlns:cx6="http://schemas.microsoft.com/office/drawing/2016/5/12/chartex" xmlns:cx7="http://schemas.microsoft.com/office/drawing/2016/5/13/chartex" xmlns:cx8="http://schemas.microsoft.com/office/drawing/2016/5/14/chartex" xmlns:mc="http://schemas.openxmlformats.org/markup-compatibility/2006" xmlns:aink="http://schemas.microsoft.com/office/drawing/2016/ink" xmlns:am3d="http://schemas.microsoft.com/office/drawing/2017/model3d" xmlns:o="urn:schemas-microsoft-com:office:office" xmlns:oel="http://schemas.microsoft.com/office/2019/extlst" xmlns:r="http://schemas.openxmlformats.org/officeDocument/2006/relationships" xmlns:m="http://schemas.openxmlformats.org/officeDocument/2006/math" xmlns:v="urn:schemas-microsoft-com:vml" xmlns:wp14="http://schemas.microsoft.com/office/word/2010/wordprocessingDrawing" xmlns:wp="http://schemas.openxmlformats.org/drawingml/2006/wordprocessingDrawing" xmlns:w10="urn:schemas-microsoft-com:office:word" xmlns:w="http://schemas.openxmlformats.org/wordprocessingml/2006/main" xmlns:w14="http://schemas.microsoft.com/office/word/2010/wordml" xmlns:w15="http://schemas.microsoft.com/office/word/2012/wordml" xmlns:w16cex="http://schemas.microsoft.com/office/word/2018/wordml/cex" xmlns:w16cid="http://schemas.microsoft.com/office/word/2016/wordml/cid" xmlns:w16="http://schemas.microsoft.com/office/word/2018/wordml" xmlns:w16du="http://schemas.microsoft.com/office/word/2023/wordml/word16du" xmlns:w16sdtdh="http://schemas.microsoft.com/office/word/2020/wordml/sdtdatahash" xmlns:w16sdtfl="http://schemas.microsoft.com/office/word/2024/wordml/sdtformatlock" xmlns:w16se="http://schemas.microsoft.com/office/word/2015/wordml/symex" xmlns:wpg="http://schemas.microsoft.com/office/word/2010/wordprocessingGroup" xmlns:wpi="http://schemas.microsoft.com/office/word/2010/wordprocessingInk" xmlns:wne="http://schemas.microsoft.com/office/word/2006/wordml" xmlns:wps="http://schemas.microsoft.com/office/word/2010/wordprocessingShape" mc:Ignorable="w14 w15 w16se w16cid w16 w16cex w16sdtdh w16sdtfl w16du wp14">
   <w:abstractNum w:abstractNumId="0" w15:restartNumberingAfterBreak="0">
     <w:nsid w:val="06BC7D31"/>
     <w:multiLevelType w:val="multilevel"/>
@@ -4584,68 +5670,68 @@
       </w:rPr>
     </w:lvl>
   </w:abstractNum>
-  <w:num w:numId="1">
+  <w:num w:numId="1" w16cid:durableId="1333486694">
     <w:abstractNumId w:val="9"/>
   </w:num>
-  <w:num w:numId="2">
+  <w:num w:numId="2" w16cid:durableId="472063039">
     <w:abstractNumId w:val="13"/>
   </w:num>
-  <w:num w:numId="3">
+  <w:num w:numId="3" w16cid:durableId="1401782169">
     <w:abstractNumId w:val="11"/>
   </w:num>
-  <w:num w:numId="4">
+  <w:num w:numId="4" w16cid:durableId="867138168">
     <w:abstractNumId w:val="12"/>
   </w:num>
-  <w:num w:numId="5">
+  <w:num w:numId="5" w16cid:durableId="469446202">
     <w:abstractNumId w:val="18"/>
   </w:num>
-  <w:num w:numId="6">
+  <w:num w:numId="6" w16cid:durableId="1702435631">
     <w:abstractNumId w:val="16"/>
   </w:num>
-  <w:num w:numId="7">
+  <w:num w:numId="7" w16cid:durableId="1039208748">
     <w:abstractNumId w:val="1"/>
   </w:num>
-  <w:num w:numId="8">
+  <w:num w:numId="8" w16cid:durableId="616986371">
     <w:abstractNumId w:val="10"/>
   </w:num>
-  <w:num w:numId="9">
+  <w:num w:numId="9" w16cid:durableId="1157111056">
     <w:abstractNumId w:val="5"/>
   </w:num>
-  <w:num w:numId="10">
+  <w:num w:numId="10" w16cid:durableId="641235700">
     <w:abstractNumId w:val="4"/>
   </w:num>
-  <w:num w:numId="11">
+  <w:num w:numId="11" w16cid:durableId="602997130">
     <w:abstractNumId w:val="17"/>
   </w:num>
-  <w:num w:numId="12">
+  <w:num w:numId="12" w16cid:durableId="716970084">
     <w:abstractNumId w:val="15"/>
   </w:num>
-  <w:num w:numId="13">
+  <w:num w:numId="13" w16cid:durableId="621033688">
     <w:abstractNumId w:val="14"/>
   </w:num>
-  <w:num w:numId="14">
+  <w:num w:numId="14" w16cid:durableId="1388841050">
     <w:abstractNumId w:val="0"/>
   </w:num>
-  <w:num w:numId="15">
+  <w:num w:numId="15" w16cid:durableId="1073239016">
     <w:abstractNumId w:val="3"/>
   </w:num>
-  <w:num w:numId="16">
+  <w:num w:numId="16" w16cid:durableId="2120488850">
     <w:abstractNumId w:val="7"/>
   </w:num>
-  <w:num w:numId="17">
+  <w:num w:numId="17" w16cid:durableId="1556114400">
     <w:abstractNumId w:val="8"/>
   </w:num>
-  <w:num w:numId="18">
+  <w:num w:numId="18" w16cid:durableId="1836411326">
     <w:abstractNumId w:val="6"/>
   </w:num>
-  <w:num w:numId="19">
+  <w:num w:numId="19" w16cid:durableId="1491369524">
     <w:abstractNumId w:val="2"/>
   </w:num>
 </w:numbering>
 </file>
 
 <file path=word/styles.xml><?xml version="1.0" encoding="utf-8"?>
-<w:styles xmlns:mc="http://schemas.openxmlformats.org/markup-compatibility/2006" xmlns:r="http://schemas.openxmlformats.org/officeDocument/2006/relationships" xmlns:w="http://schemas.openxmlformats.org/wordprocessingml/2006/main" xmlns:w14="http://schemas.microsoft.com/office/word/2010/wordml" xmlns:w15="http://schemas.microsoft.com/office/word/2012/wordml" xmlns:w16cid="http://schemas.microsoft.com/office/word/2016/wordml/cid" xmlns:w16se="http://schemas.microsoft.com/office/word/2015/wordml/symex" mc:Ignorable="w14 w15 w16se w16cid">
+<w:styles xmlns:mc="http://schemas.openxmlformats.org/markup-compatibility/2006" xmlns:r="http://schemas.openxmlformats.org/officeDocument/2006/relationships" xmlns:w="http://schemas.openxmlformats.org/wordprocessingml/2006/main" xmlns:w14="http://schemas.microsoft.com/office/word/2010/wordml" xmlns:w15="http://schemas.microsoft.com/office/word/2012/wordml" xmlns:w16cex="http://schemas.microsoft.com/office/word/2018/wordml/cex" xmlns:w16cid="http://schemas.microsoft.com/office/word/2016/wordml/cid" xmlns:w16="http://schemas.microsoft.com/office/word/2018/wordml" xmlns:w16du="http://schemas.microsoft.com/office/word/2023/wordml/word16du" xmlns:w16sdtdh="http://schemas.microsoft.com/office/word/2020/wordml/sdtdatahash" xmlns:w16sdtfl="http://schemas.microsoft.com/office/word/2024/wordml/sdtformatlock" xmlns:w16se="http://schemas.microsoft.com/office/word/2015/wordml/symex" mc:Ignorable="w14 w15 w16se w16cid w16 w16cex w16sdtdh w16sdtfl w16du">
   <w:docDefaults>
     <w:rPrDefault>
       <w:rPr>
@@ -4663,7 +5749,7 @@
       </w:pPr>
     </w:pPrDefault>
   </w:docDefaults>
-  <w:latentStyles w:defLockedState="0" w:defUIPriority="99" w:defSemiHidden="0" w:defUnhideWhenUsed="0" w:defQFormat="0" w:count="375">
+  <w:latentStyles w:defLockedState="0" w:defUIPriority="99" w:defSemiHidden="0" w:defUnhideWhenUsed="0" w:defQFormat="0" w:count="376">
     <w:lsdException w:name="Normal" w:uiPriority="0" w:qFormat="1"/>
     <w:lsdException w:name="heading 1" w:uiPriority="9" w:qFormat="1"/>
     <w:lsdException w:name="heading 2" w:semiHidden="1" w:uiPriority="9" w:unhideWhenUsed="1" w:qFormat="1"/>
@@ -5039,6 +6125,7 @@
     <w:lsdException w:name="Smart Hyperlink" w:semiHidden="1" w:unhideWhenUsed="1"/>
     <w:lsdException w:name="Hashtag" w:semiHidden="1" w:unhideWhenUsed="1"/>
     <w:lsdException w:name="Unresolved Mention" w:semiHidden="1" w:unhideWhenUsed="1"/>
+    <w:lsdException w:name="Smart Link" w:semiHidden="1" w:unhideWhenUsed="1"/>
   </w:latentStyles>
   <w:style w:type="paragraph" w:default="1" w:styleId="Norml">
     <w:name w:val="Normal"/>
@@ -5246,7 +6333,6 @@
   <w:style w:type="character" w:default="1" w:styleId="Bekezdsalapbettpusa">
     <w:name w:val="Default Paragraph Font"/>
     <w:uiPriority w:val="1"/>
-    <w:semiHidden/>
     <w:unhideWhenUsed/>
   </w:style>
   <w:style w:type="table" w:default="1" w:styleId="Normltblzat">
@@ -5588,6 +6674,50 @@
       <w14:ligatures w14:val="none"/>
     </w:rPr>
   </w:style>
+  <w:style w:type="paragraph" w:styleId="lfej">
+    <w:name w:val="header"/>
+    <w:basedOn w:val="Norml"/>
+    <w:link w:val="lfejChar"/>
+    <w:uiPriority w:val="99"/>
+    <w:unhideWhenUsed/>
+    <w:rsid w:val="006C1BD2"/>
+    <w:pPr>
+      <w:tabs>
+        <w:tab w:val="center" w:pos="4536"/>
+        <w:tab w:val="right" w:pos="9072"/>
+      </w:tabs>
+      <w:spacing w:after="0" w:line="240" w:lineRule="auto"/>
+    </w:pPr>
+  </w:style>
+  <w:style w:type="character" w:customStyle="1" w:styleId="lfejChar">
+    <w:name w:val="Élőfej Char"/>
+    <w:basedOn w:val="Bekezdsalapbettpusa"/>
+    <w:link w:val="lfej"/>
+    <w:uiPriority w:val="99"/>
+    <w:rsid w:val="006C1BD2"/>
+  </w:style>
+  <w:style w:type="paragraph" w:styleId="llb">
+    <w:name w:val="footer"/>
+    <w:basedOn w:val="Norml"/>
+    <w:link w:val="llbChar"/>
+    <w:uiPriority w:val="99"/>
+    <w:unhideWhenUsed/>
+    <w:rsid w:val="006C1BD2"/>
+    <w:pPr>
+      <w:tabs>
+        <w:tab w:val="center" w:pos="4536"/>
+        <w:tab w:val="right" w:pos="9072"/>
+      </w:tabs>
+      <w:spacing w:after="0" w:line="240" w:lineRule="auto"/>
+    </w:pPr>
+  </w:style>
+  <w:style w:type="character" w:customStyle="1" w:styleId="llbChar">
+    <w:name w:val="Élőláb Char"/>
+    <w:basedOn w:val="Bekezdsalapbettpusa"/>
+    <w:link w:val="llb"/>
+    <w:uiPriority w:val="99"/>
+    <w:rsid w:val="006C1BD2"/>
+  </w:style>
 </w:styles>
 </file>
 

</xml_diff>